<commit_message>
Complete Project 6 Phase 2 with ECS Fargate and ALB.
Deploy the ECR image on Fargate behind a public ALB with VPC networking and CloudWatch logs on the cheap public-subnet path.

Co-authored-by: Cursor <cursoragent@cursor.com>
</commit_message>
<xml_diff>
--- a/project-6-secure-containers/docs/Project 6 - What was Implemented.docx
+++ b/project-6-secure-containers/docs/Project 6 - What was Implemented.docx
@@ -20,47 +20,920 @@
     </w:p>
     <w:p>
       <w:pPr>
+        <w:jc w:val="center"/>
+      </w:pPr>
+    </w:p>
+    <w:p>
+      <w:r>
+        <w:drawing>
+          <wp:inline distT="0" distB="0" distL="0" distR="0" wp14:anchorId="4EF0ECED" wp14:editId="0A8C0BE3">
+            <wp:extent cx="5943600" cy="1179830"/>
+            <wp:effectExtent l="0" t="0" r="0" b="1270"/>
+            <wp:docPr id="1060924991" name="Picture 1"/>
+            <wp:cNvGraphicFramePr>
+              <a:graphicFrameLocks xmlns:a="http://schemas.openxmlformats.org/drawingml/2006/main" noChangeAspect="1"/>
+            </wp:cNvGraphicFramePr>
+            <a:graphic xmlns:a="http://schemas.openxmlformats.org/drawingml/2006/main">
+              <a:graphicData uri="http://schemas.openxmlformats.org/drawingml/2006/picture">
+                <pic:pic xmlns:pic="http://schemas.openxmlformats.org/drawingml/2006/picture">
+                  <pic:nvPicPr>
+                    <pic:cNvPr id="1060924991" name=""/>
+                    <pic:cNvPicPr/>
+                  </pic:nvPicPr>
+                  <pic:blipFill>
+                    <a:blip r:embed="rId5"/>
+                    <a:stretch>
+                      <a:fillRect/>
+                    </a:stretch>
+                  </pic:blipFill>
+                  <pic:spPr>
+                    <a:xfrm>
+                      <a:off x="0" y="0"/>
+                      <a:ext cx="5943600" cy="1179830"/>
+                    </a:xfrm>
+                    <a:prstGeom prst="rect">
+                      <a:avLst/>
+                    </a:prstGeom>
+                  </pic:spPr>
+                </pic:pic>
+              </a:graphicData>
+            </a:graphic>
+          </wp:inline>
+        </w:drawing>
+      </w:r>
+    </w:p>
+    <w:p>
+      <w:pPr>
+        <w:rPr>
+          <w:u w:val="single"/>
+        </w:rPr>
+      </w:pPr>
+      <w:r>
+        <w:rPr>
+          <w:u w:val="single"/>
+        </w:rPr>
+        <w:t>Installed Docker Desktop</w:t>
+      </w:r>
+      <w:r>
+        <w:rPr>
+          <w:u w:val="single"/>
+        </w:rPr>
+        <w:t xml:space="preserve"> 4.93</w:t>
+      </w:r>
+    </w:p>
+    <w:p>
+      <w:r>
+        <w:t xml:space="preserve">Installed WSL (Windows </w:t>
+      </w:r>
+      <w:proofErr w:type="spellStart"/>
+      <w:r>
+        <w:t>SubSystem</w:t>
+      </w:r>
+      <w:proofErr w:type="spellEnd"/>
+      <w:r>
+        <w:t xml:space="preserve"> for Linux) Backend</w:t>
+      </w:r>
+      <w:r>
+        <w:t xml:space="preserve"> 2.</w:t>
+      </w:r>
+      <w:r>
+        <w:t>7.14</w:t>
+      </w:r>
+    </w:p>
+    <w:p>
+      <w:pPr>
+        <w:pStyle w:val="ListParagraph"/>
+        <w:ind w:left="1440"/>
+      </w:pPr>
+    </w:p>
+    <w:p>
+      <w:pPr>
+        <w:rPr>
+          <w:u w:val="single"/>
+        </w:rPr>
+      </w:pPr>
+      <w:r>
+        <w:rPr>
+          <w:u w:val="single"/>
+        </w:rPr>
+        <w:t>W</w:t>
+      </w:r>
+      <w:r>
+        <w:rPr>
+          <w:u w:val="single"/>
+        </w:rPr>
+        <w:t xml:space="preserve">hy use flask as the base app vs </w:t>
+      </w:r>
+      <w:proofErr w:type="spellStart"/>
+      <w:r>
+        <w:rPr>
+          <w:u w:val="single"/>
+        </w:rPr>
+        <w:t>gunicorn</w:t>
+      </w:r>
+      <w:proofErr w:type="spellEnd"/>
+      <w:r>
+        <w:rPr>
+          <w:u w:val="single"/>
+        </w:rPr>
+        <w:t>/</w:t>
+      </w:r>
+      <w:proofErr w:type="spellStart"/>
+      <w:r>
+        <w:rPr>
+          <w:u w:val="single"/>
+        </w:rPr>
+        <w:t>uWSGI</w:t>
+      </w:r>
+      <w:proofErr w:type="spellEnd"/>
+      <w:r>
+        <w:rPr>
+          <w:u w:val="single"/>
+        </w:rPr>
+        <w:t xml:space="preserve"> from the start?</w:t>
+      </w:r>
+    </w:p>
+    <w:p>
+      <w:r>
+        <w:t>They’re not two competing “base apps.” They do different jobs.</w:t>
+      </w:r>
+    </w:p>
+    <w:p>
+      <w:pPr>
+        <w:numPr>
+          <w:ilvl w:val="0"/>
+          <w:numId w:val="2"/>
+        </w:numPr>
+      </w:pPr>
+      <w:r>
+        <w:t>Flask = the application (routes like /health, your Python logic)</w:t>
+      </w:r>
+    </w:p>
+    <w:p>
+      <w:pPr>
+        <w:numPr>
+          <w:ilvl w:val="0"/>
+          <w:numId w:val="2"/>
+        </w:numPr>
+      </w:pPr>
+      <w:proofErr w:type="spellStart"/>
+      <w:r>
+        <w:t>Gunicorn</w:t>
+      </w:r>
+      <w:proofErr w:type="spellEnd"/>
+      <w:r>
+        <w:t xml:space="preserve"> / </w:t>
+      </w:r>
+      <w:proofErr w:type="spellStart"/>
+      <w:r>
+        <w:t>uWSGI</w:t>
+      </w:r>
+      <w:proofErr w:type="spellEnd"/>
+      <w:r>
+        <w:t> = a server process that </w:t>
+      </w:r>
+      <w:r>
+        <w:rPr>
+          <w:i/>
+          <w:iCs/>
+        </w:rPr>
+        <w:t>runs</w:t>
+      </w:r>
+      <w:r>
+        <w:t> that application</w:t>
+      </w:r>
+    </w:p>
+    <w:p>
+      <w:proofErr w:type="spellStart"/>
+      <w:r>
+        <w:t>Gunicorn</w:t>
+      </w:r>
+      <w:proofErr w:type="spellEnd"/>
+      <w:r>
+        <w:t xml:space="preserve"> doesn’t replace Flask. It loads your Flask app and serves it. Without an app framework (Flask, </w:t>
+      </w:r>
+      <w:proofErr w:type="spellStart"/>
+      <w:r>
+        <w:t>FastAPI</w:t>
+      </w:r>
+      <w:proofErr w:type="spellEnd"/>
+      <w:r>
+        <w:t xml:space="preserve">, Django, etc.), </w:t>
+      </w:r>
+      <w:proofErr w:type="spellStart"/>
+      <w:r>
+        <w:t>Gunicorn</w:t>
+      </w:r>
+      <w:proofErr w:type="spellEnd"/>
+      <w:r>
+        <w:t xml:space="preserve"> has nothing meaningful to run.</w:t>
+      </w:r>
+    </w:p>
+    <w:p>
+      <w:r>
+        <w:t>We started with Flask alone because:</w:t>
+      </w:r>
+    </w:p>
+    <w:p>
+      <w:pPr>
+        <w:numPr>
+          <w:ilvl w:val="0"/>
+          <w:numId w:val="3"/>
+        </w:numPr>
+      </w:pPr>
+      <w:r>
+        <w:t>Fewer moving parts for Phase 0 — prove Docker works with one simple process</w:t>
+      </w:r>
+    </w:p>
+    <w:p>
+      <w:pPr>
+        <w:numPr>
+          <w:ilvl w:val="0"/>
+          <w:numId w:val="3"/>
+        </w:numPr>
+      </w:pPr>
+      <w:r>
+        <w:t>Flask includes a tiny built-in server (</w:t>
+      </w:r>
+      <w:proofErr w:type="spellStart"/>
+      <w:r>
+        <w:t>Werkzeug</w:t>
+      </w:r>
+      <w:proofErr w:type="spellEnd"/>
+      <w:r>
+        <w:t>) that’s fine for local/lab demos</w:t>
+      </w:r>
+    </w:p>
+    <w:p>
+      <w:pPr>
+        <w:numPr>
+          <w:ilvl w:val="0"/>
+          <w:numId w:val="3"/>
+        </w:numPr>
+      </w:pPr>
+      <w:r>
+        <w:t xml:space="preserve">Later you can keep the same Flask code and only change how </w:t>
+      </w:r>
+      <w:proofErr w:type="gramStart"/>
+      <w:r>
+        <w:t>it’s started</w:t>
+      </w:r>
+      <w:proofErr w:type="gramEnd"/>
+      <w:r>
+        <w:t>:</w:t>
+      </w:r>
+    </w:p>
+    <w:p/>
+    <w:p>
+      <w:r>
+        <w:t>Differences that matter</w:t>
+      </w:r>
+    </w:p>
+    <w:p>
+      <w:pPr>
+        <w:numPr>
+          <w:ilvl w:val="0"/>
+          <w:numId w:val="4"/>
+        </w:numPr>
+      </w:pPr>
+      <w:proofErr w:type="spellStart"/>
+      <w:r>
+        <w:t>Gunicorn</w:t>
+      </w:r>
+      <w:proofErr w:type="spellEnd"/>
+      <w:r>
+        <w:t xml:space="preserve"> / </w:t>
+      </w:r>
+      <w:proofErr w:type="spellStart"/>
+      <w:r>
+        <w:t>uWSGI</w:t>
+      </w:r>
+      <w:proofErr w:type="spellEnd"/>
+      <w:r>
+        <w:t> </w:t>
+      </w:r>
+      <w:proofErr w:type="gramStart"/>
+      <w:r>
+        <w:t>speak</w:t>
+      </w:r>
+      <w:proofErr w:type="gramEnd"/>
+      <w:r>
+        <w:t xml:space="preserve"> Python’s WSGI interface. They </w:t>
+      </w:r>
+      <w:r>
+        <w:rPr>
+          <w:i/>
+          <w:iCs/>
+        </w:rPr>
+        <w:t>run</w:t>
+      </w:r>
+      <w:r>
+        <w:t xml:space="preserve"> your Flask app. They are not full-featured public edge servers (TLS termination, </w:t>
+      </w:r>
+      <w:proofErr w:type="gramStart"/>
+      <w:r>
+        <w:t>caching</w:t>
+      </w:r>
+      <w:proofErr w:type="gramEnd"/>
+      <w:r>
+        <w:t>, etc. are weaker or secondary).</w:t>
+      </w:r>
+    </w:p>
+    <w:p>
+      <w:pPr>
+        <w:numPr>
+          <w:ilvl w:val="0"/>
+          <w:numId w:val="4"/>
+        </w:numPr>
+      </w:pPr>
+      <w:r>
+        <w:t xml:space="preserve">nginx is a high-performance edge/proxy. It usually does not run Flask itself; it forwards to </w:t>
+      </w:r>
+      <w:proofErr w:type="spellStart"/>
+      <w:r>
+        <w:t>Gunicorn</w:t>
+      </w:r>
+      <w:proofErr w:type="spellEnd"/>
+      <w:r>
+        <w:t>/</w:t>
+      </w:r>
+      <w:proofErr w:type="spellStart"/>
+      <w:r>
+        <w:t>uWSGI</w:t>
+      </w:r>
+      <w:proofErr w:type="spellEnd"/>
+      <w:r>
+        <w:t>. Great at HTTPS, load balancing, static files, buffering.</w:t>
+      </w:r>
+    </w:p>
+    <w:p>
+      <w:pPr>
+        <w:numPr>
+          <w:ilvl w:val="0"/>
+          <w:numId w:val="4"/>
+        </w:numPr>
+      </w:pPr>
+      <w:r>
+        <w:lastRenderedPageBreak/>
+        <w:t>IIS is the Windows equivalent of that edge/web role. Common in Microsoft shops; less common inside Linux Docker/ECS labs like Project 6.</w:t>
+      </w:r>
+    </w:p>
+    <w:p>
+      <w:r>
+        <w:t>For Project 6: ECS + ALB already plays the “front door” role (like nginx/IIS for routing/health checks). Gunicorn would replace Flask’s built-in server </w:t>
+      </w:r>
+      <w:r>
+        <w:rPr>
+          <w:i/>
+          <w:iCs/>
+        </w:rPr>
+        <w:t>inside</w:t>
+      </w:r>
+      <w:r>
+        <w:t> the container. You don’t need nginx </w:t>
+      </w:r>
+      <w:r>
+        <w:rPr>
+          <w:i/>
+          <w:iCs/>
+        </w:rPr>
+        <w:t>and</w:t>
+      </w:r>
+      <w:r>
+        <w:t> ALB unless you want an extra proxy layer.</w:t>
+      </w:r>
+    </w:p>
+    <w:p>
+      <w:r>
+        <w:t>What Docker Desktop did</w:t>
+      </w:r>
+    </w:p>
+    <w:p>
+      <w:r>
+        <w:t>Docker Desktop wasn’t only for building — it did three jobs in this lab:</w:t>
+      </w:r>
+    </w:p>
+    <w:p>
+      <w:pPr>
+        <w:numPr>
+          <w:ilvl w:val="0"/>
+          <w:numId w:val="6"/>
+        </w:numPr>
+      </w:pPr>
+      <w:r>
+        <w:t>Build the image from the Dockerfile</w:t>
+      </w:r>
+    </w:p>
+    <w:p>
+      <w:pPr>
+        <w:numPr>
+          <w:ilvl w:val="0"/>
+          <w:numId w:val="6"/>
+        </w:numPr>
+      </w:pPr>
+      <w:r>
+        <w:t>Run it locally (Phase 0 tests on port 8080)</w:t>
+      </w:r>
+    </w:p>
+    <w:p>
+      <w:pPr>
+        <w:numPr>
+          <w:ilvl w:val="0"/>
+          <w:numId w:val="6"/>
+        </w:numPr>
+      </w:pPr>
+      <w:r>
+        <w:t>Push that local image to ECR (docker push talks to your local Docker engine)</w:t>
+      </w:r>
+    </w:p>
+    <w:p/>
+    <w:p>
+      <w:r>
+        <w:t>Implement</w:t>
+      </w:r>
+      <w:r>
+        <w:t xml:space="preserve">ation </w:t>
+      </w:r>
+      <w:proofErr w:type="gramStart"/>
+      <w:r>
+        <w:t>Step-by-Step</w:t>
+      </w:r>
+      <w:proofErr w:type="gramEnd"/>
+    </w:p>
+    <w:p>
+      <w:pPr>
+        <w:rPr>
+          <w:b/>
+          <w:bCs/>
+        </w:rPr>
+      </w:pPr>
+      <w:r>
+        <w:rPr>
+          <w:b/>
+          <w:bCs/>
+        </w:rPr>
+        <w:t>Step 1 — Build (on your PC)</w:t>
+      </w:r>
+    </w:p>
+    <w:p>
+      <w:r>
+        <w:t>From the app/ folder:</w:t>
+      </w:r>
+    </w:p>
+    <w:p>
+      <w:r>
+        <w:t>docker build -t project6-</w:t>
+      </w:r>
+      <w:proofErr w:type="gramStart"/>
+      <w:r>
+        <w:t>api:local</w:t>
+      </w:r>
+      <w:proofErr w:type="gramEnd"/>
+      <w:r>
+        <w:t xml:space="preserve"> .</w:t>
+      </w:r>
+    </w:p>
+    <w:p>
+      <w:r>
+        <w:t xml:space="preserve">What </w:t>
+      </w:r>
+      <w:proofErr w:type="gramStart"/>
+      <w:r>
+        <w:t>that does</w:t>
+      </w:r>
+      <w:proofErr w:type="gramEnd"/>
+      <w:r>
+        <w:t>:</w:t>
+      </w:r>
+    </w:p>
+    <w:p>
+      <w:pPr>
+        <w:numPr>
+          <w:ilvl w:val="0"/>
+          <w:numId w:val="5"/>
+        </w:numPr>
+      </w:pPr>
+      <w:r>
+        <w:t>Reads Dockerfile</w:t>
+      </w:r>
+    </w:p>
+    <w:p>
+      <w:pPr>
+        <w:numPr>
+          <w:ilvl w:val="0"/>
+          <w:numId w:val="5"/>
+        </w:numPr>
+      </w:pPr>
+      <w:r>
+        <w:t>Pulls base image python:3.12.7-slim-bookworm</w:t>
+      </w:r>
+    </w:p>
+    <w:p>
+      <w:pPr>
+        <w:numPr>
+          <w:ilvl w:val="0"/>
+          <w:numId w:val="5"/>
+        </w:numPr>
+      </w:pPr>
+      <w:r>
+        <w:t>Copies requirements.txt / main.py, installs Flask, creates non-root user</w:t>
+      </w:r>
+    </w:p>
+    <w:p>
+      <w:pPr>
+        <w:numPr>
+          <w:ilvl w:val="0"/>
+          <w:numId w:val="5"/>
+        </w:numPr>
+      </w:pPr>
+      <w:proofErr w:type="gramStart"/>
+      <w:r>
+        <w:t>Stores</w:t>
+      </w:r>
+      <w:proofErr w:type="gramEnd"/>
+      <w:r>
+        <w:t xml:space="preserve"> the result locally as project6-</w:t>
+      </w:r>
+      <w:proofErr w:type="gramStart"/>
+      <w:r>
+        <w:t>api:local</w:t>
+      </w:r>
+      <w:proofErr w:type="gramEnd"/>
+    </w:p>
+    <w:p>
+      <w:r>
+        <w:t>At this point the image exists only on your machine (Docker Desktop), not in AWS yet.</w:t>
+      </w:r>
+    </w:p>
+    <w:p>
+      <w:pPr>
+        <w:rPr>
+          <w:b/>
+          <w:bCs/>
+        </w:rPr>
+      </w:pPr>
+      <w:r>
+        <w:rPr>
+          <w:b/>
+          <w:bCs/>
+        </w:rPr>
+        <w:t xml:space="preserve">Step </w:t>
+      </w:r>
+      <w:proofErr w:type="gramStart"/>
+      <w:r>
+        <w:rPr>
+          <w:b/>
+          <w:bCs/>
+        </w:rPr>
+        <w:t>2 — (</w:t>
+      </w:r>
+      <w:proofErr w:type="gramEnd"/>
+      <w:r>
+        <w:rPr>
+          <w:b/>
+          <w:bCs/>
+        </w:rPr>
+        <w:t>Optional) Run locally</w:t>
+      </w:r>
+    </w:p>
+    <w:p>
+      <w:r>
+        <w:t>docker run --rm -p 8080:8080 -e APP_SECRET=local-demo-secret project6-</w:t>
+      </w:r>
+      <w:proofErr w:type="gramStart"/>
+      <w:r>
+        <w:t>api:local</w:t>
+      </w:r>
+      <w:proofErr w:type="gramEnd"/>
+    </w:p>
+    <w:p>
+      <w:r>
+        <w:t>That starts a container from the local image so you can hit /health and /info. Useful to prove the image works before uploading.</w:t>
+      </w:r>
+    </w:p>
+    <w:p/>
+    <w:p/>
+    <w:p>
+      <w:pPr>
+        <w:rPr>
+          <w:b/>
+          <w:bCs/>
+        </w:rPr>
+      </w:pPr>
+      <w:r>
+        <w:rPr>
+          <w:b/>
+          <w:bCs/>
+        </w:rPr>
+        <w:lastRenderedPageBreak/>
+        <w:t>Step 3 — Create the ECR “bucket” for images (Terraform)</w:t>
+      </w:r>
+    </w:p>
+    <w:p>
+      <w:r>
+        <w:t>cd ...\project-6-secure-containers\terraform</w:t>
+      </w:r>
+    </w:p>
+    <w:p>
+      <w:proofErr w:type="gramStart"/>
+      <w:r>
+        <w:t>terraform apply</w:t>
+      </w:r>
+      <w:proofErr w:type="gramEnd"/>
+    </w:p>
+    <w:p>
+      <w:r>
+        <w:t>That created the empty AWS repo: project6-api.</w:t>
+      </w:r>
+      <w:r>
+        <w:br/>
+        <w:t> Still no image in AWS until you push.</w:t>
+      </w:r>
+    </w:p>
+    <w:p>
+      <w:pPr>
+        <w:rPr>
+          <w:b/>
+          <w:bCs/>
+        </w:rPr>
+      </w:pPr>
+      <w:r>
+        <w:rPr>
+          <w:b/>
+          <w:bCs/>
+        </w:rPr>
+        <w:t>Step 4 — Log Docker into ECR</w:t>
+      </w:r>
+    </w:p>
+    <w:p>
+      <w:proofErr w:type="spellStart"/>
+      <w:r>
+        <w:t>aws</w:t>
+      </w:r>
+      <w:proofErr w:type="spellEnd"/>
+      <w:r>
+        <w:t xml:space="preserve"> </w:t>
+      </w:r>
+      <w:proofErr w:type="spellStart"/>
+      <w:r>
+        <w:t>ecr</w:t>
+      </w:r>
+      <w:proofErr w:type="spellEnd"/>
+      <w:r>
+        <w:t xml:space="preserve"> get-login-password --region us-east-1 |</w:t>
+      </w:r>
+    </w:p>
+    <w:p>
+      <w:r>
+        <w:t xml:space="preserve">  docker login --username AWS --password-stdin 345485442145.dkr.ecr.us-east-1.amazonaws.com</w:t>
+      </w:r>
+    </w:p>
+    <w:p>
+      <w:r>
+        <w:t>This gives your local Docker permission to push to your account’s registry.</w:t>
+      </w:r>
+    </w:p>
+    <w:p>
+      <w:pPr>
+        <w:rPr>
+          <w:b/>
+          <w:bCs/>
+        </w:rPr>
+      </w:pPr>
+      <w:r>
+        <w:rPr>
+          <w:b/>
+          <w:bCs/>
+        </w:rPr>
+        <w:t>Step 5 — Tag (rename for ECR’s address)</w:t>
+      </w:r>
+    </w:p>
+    <w:p>
+      <w:r>
+        <w:t>docker tag project6-</w:t>
+      </w:r>
+      <w:proofErr w:type="gramStart"/>
+      <w:r>
+        <w:t>api:local</w:t>
+      </w:r>
+      <w:proofErr w:type="gramEnd"/>
+      <w:r>
+        <w:t xml:space="preserve"> 345485442145.dkr.ecr.us-east-1.amazonaws.com/project6-</w:t>
+      </w:r>
+      <w:proofErr w:type="gramStart"/>
+      <w:r>
+        <w:t>api:latest</w:t>
+      </w:r>
+      <w:proofErr w:type="gramEnd"/>
+    </w:p>
+    <w:p>
+      <w:r>
+        <w:t>Same image, second name pointing at ECR. latest is just the tag label.</w:t>
+      </w:r>
+    </w:p>
+    <w:p>
+      <w:pPr>
+        <w:rPr>
+          <w:b/>
+          <w:bCs/>
+        </w:rPr>
+      </w:pPr>
+      <w:r>
+        <w:rPr>
+          <w:b/>
+          <w:bCs/>
+        </w:rPr>
+        <w:t>Step 6 — Push (upload)</w:t>
+      </w:r>
+    </w:p>
+    <w:p>
+      <w:r>
+        <w:t>docker push 345485442145.dkr.ecr.us-east-1.amazonaws.com/project6-</w:t>
+      </w:r>
+      <w:proofErr w:type="gramStart"/>
+      <w:r>
+        <w:t>api:latest</w:t>
+      </w:r>
+      <w:proofErr w:type="gramEnd"/>
+    </w:p>
+    <w:p>
+      <w:r>
+        <w:t>Docker Desktop uploads the image layers to ECR. After that, AWS has a copy ECS can pull in Phase 2 — your laptop doesn’t need to stay running.</w:t>
+      </w:r>
+    </w:p>
+    <w:p>
+      <w:r>
+        <w:t>Flow in one picture</w:t>
+      </w:r>
+    </w:p>
+    <w:p>
+      <w:r>
+        <w:drawing>
+          <wp:inline distT="0" distB="0" distL="0" distR="0" wp14:anchorId="25F272DC" wp14:editId="612D170B">
+            <wp:extent cx="3642676" cy="2522439"/>
+            <wp:effectExtent l="0" t="0" r="0" b="0"/>
+            <wp:docPr id="1427081232" name="Picture 1"/>
+            <wp:cNvGraphicFramePr>
+              <a:graphicFrameLocks xmlns:a="http://schemas.openxmlformats.org/drawingml/2006/main" noChangeAspect="1"/>
+            </wp:cNvGraphicFramePr>
+            <a:graphic xmlns:a="http://schemas.openxmlformats.org/drawingml/2006/main">
+              <a:graphicData uri="http://schemas.openxmlformats.org/drawingml/2006/picture">
+                <pic:pic xmlns:pic="http://schemas.openxmlformats.org/drawingml/2006/picture">
+                  <pic:nvPicPr>
+                    <pic:cNvPr id="1427081232" name=""/>
+                    <pic:cNvPicPr/>
+                  </pic:nvPicPr>
+                  <pic:blipFill>
+                    <a:blip r:embed="rId6"/>
+                    <a:stretch>
+                      <a:fillRect/>
+                    </a:stretch>
+                  </pic:blipFill>
+                  <pic:spPr>
+                    <a:xfrm>
+                      <a:off x="0" y="0"/>
+                      <a:ext cx="3642676" cy="2522439"/>
+                    </a:xfrm>
+                    <a:prstGeom prst="rect">
+                      <a:avLst/>
+                    </a:prstGeom>
+                  </pic:spPr>
+                </pic:pic>
+              </a:graphicData>
+            </a:graphic>
+          </wp:inline>
+        </w:drawing>
+      </w:r>
+    </w:p>
+    <w:p>
+      <w:r>
+        <w:lastRenderedPageBreak/>
+        <w:t>Phase 2</w:t>
+      </w:r>
+    </w:p>
+    <w:p>
+      <w:r>
+        <w:t>Test these:</w:t>
+      </w:r>
+    </w:p>
+    <w:p>
+      <w:pPr>
         <w:pStyle w:val="ListParagraph"/>
         <w:numPr>
           <w:ilvl w:val="0"/>
-          <w:numId w:val="1"/>
+          <w:numId w:val="7"/>
         </w:numPr>
       </w:pPr>
       <w:r>
-        <w:t>Installed Docker Desktop</w:t>
-      </w:r>
-      <w:r>
-        <w:t xml:space="preserve"> 4.93</w:t>
-      </w:r>
-    </w:p>
-    <w:p>
-      <w:pPr>
-        <w:pStyle w:val="ListParagraph"/>
-        <w:numPr>
-          <w:ilvl w:val="1"/>
-          <w:numId w:val="1"/>
-        </w:numPr>
-      </w:pPr>
-      <w:r>
-        <w:t>Installed WSL (Windows SubSystem for Linux) Backend</w:t>
-      </w:r>
-      <w:r>
-        <w:t xml:space="preserve"> 2.</w:t>
-      </w:r>
-      <w:r>
-        <w:t>7.14</w:t>
-      </w:r>
+        <w:t>Health: project6-lab-alb-1609487481.us-east-1.elb.amazonaws.com/health → {"</w:t>
+      </w:r>
+      <w:proofErr w:type="spellStart"/>
+      <w:r>
+        <w:t>status":"</w:t>
+      </w:r>
+      <w:proofErr w:type="gramStart"/>
+      <w:r>
+        <w:t>ok</w:t>
+      </w:r>
+      <w:proofErr w:type="spellEnd"/>
+      <w:r>
+        <w:t>"}</w:t>
+      </w:r>
+      <w:proofErr w:type="gramEnd"/>
     </w:p>
     <w:p>
       <w:pPr>
         <w:pStyle w:val="ListParagraph"/>
         <w:numPr>
           <w:ilvl w:val="0"/>
-          <w:numId w:val="1"/>
+          <w:numId w:val="7"/>
         </w:numPr>
       </w:pPr>
-    </w:p>
-    <w:p/>
+      <w:r>
+        <w:t xml:space="preserve">Info: project6-lab-alb-1609487481.us-east-1.elb.amazonaws.com/info → hostname + </w:t>
+      </w:r>
+      <w:proofErr w:type="spellStart"/>
+      <w:r>
+        <w:t>secret_configured</w:t>
+      </w:r>
+      <w:proofErr w:type="spellEnd"/>
+      <w:r>
+        <w:t>: true</w:t>
+      </w:r>
+    </w:p>
+    <w:p>
+      <w:r>
+        <w:t>What Terraform added</w:t>
+      </w:r>
+    </w:p>
+    <w:p>
+      <w:pPr>
+        <w:pStyle w:val="ListParagraph"/>
+        <w:numPr>
+          <w:ilvl w:val="0"/>
+          <w:numId w:val="8"/>
+        </w:numPr>
+      </w:pPr>
+      <w:r>
+        <w:t>VPC + 2 public subnets (no NAT)</w:t>
+      </w:r>
+    </w:p>
+    <w:p>
+      <w:pPr>
+        <w:pStyle w:val="ListParagraph"/>
+        <w:numPr>
+          <w:ilvl w:val="0"/>
+          <w:numId w:val="8"/>
+        </w:numPr>
+      </w:pPr>
+      <w:r>
+        <w:t>ALB on port 80 → target group health check /health</w:t>
+      </w:r>
+    </w:p>
+    <w:p>
+      <w:pPr>
+        <w:pStyle w:val="ListParagraph"/>
+        <w:numPr>
+          <w:ilvl w:val="0"/>
+          <w:numId w:val="8"/>
+        </w:numPr>
+      </w:pPr>
+      <w:r>
+        <w:t>ECS cluster/service, 1 Fargate task (0.25 vCPU / 512 MB)</w:t>
+      </w:r>
+    </w:p>
+    <w:p>
+      <w:pPr>
+        <w:pStyle w:val="ListParagraph"/>
+        <w:numPr>
+          <w:ilvl w:val="0"/>
+          <w:numId w:val="8"/>
+        </w:numPr>
+      </w:pPr>
+      <w:r>
+        <w:t>CloudWatch logs: /</w:t>
+      </w:r>
+      <w:proofErr w:type="spellStart"/>
+      <w:r>
+        <w:t>ecs</w:t>
+      </w:r>
+      <w:proofErr w:type="spellEnd"/>
+      <w:r>
+        <w:t>/project6-lab-api</w:t>
+      </w:r>
+    </w:p>
+    <w:p>
+      <w:pPr>
+        <w:pStyle w:val="ListParagraph"/>
+        <w:numPr>
+          <w:ilvl w:val="0"/>
+          <w:numId w:val="8"/>
+        </w:numPr>
+      </w:pPr>
+      <w:r>
+        <w:t>Cost: ALB + Fargate are billing while this stays up. When you’re done for the day, say if you want me to terraform destroy or scale to 0.</w:t>
+      </w:r>
+    </w:p>
     <w:sectPr>
       <w:pgSz w:w="12240" w:h="15840"/>
       <w:pgMar w:top="1440" w:right="1440" w:bottom="1440" w:left="1440" w:header="720" w:footer="720" w:gutter="0"/>
@@ -74,6 +947,381 @@
 <file path=word/numbering.xml><?xml version="1.0" encoding="utf-8"?>
 <w:numbering xmlns:wpc="http://schemas.microsoft.com/office/word/2010/wordprocessingCanvas" xmlns:cx="http://schemas.microsoft.com/office/drawing/2014/chartex" xmlns:cx1="http://schemas.microsoft.com/office/drawing/2015/9/8/chartex" xmlns:cx2="http://schemas.microsoft.com/office/drawing/2015/10/21/chartex" xmlns:cx3="http://schemas.microsoft.com/office/drawing/2016/5/9/chartex" xmlns:cx4="http://schemas.microsoft.com/office/drawing/2016/5/10/chartex" xmlns:cx5="http://schemas.microsoft.com/office/drawing/2016/5/11/chartex" xmlns:cx6="http://schemas.microsoft.com/office/drawing/2016/5/12/chartex" xmlns:cx7="http://schemas.microsoft.com/office/drawing/2016/5/13/chartex" xmlns:cx8="http://schemas.microsoft.com/office/drawing/2016/5/14/chartex" xmlns:mc="http://schemas.openxmlformats.org/markup-compatibility/2006" xmlns:aink="http://schemas.microsoft.com/office/drawing/2016/ink" xmlns:am3d="http://schemas.microsoft.com/office/drawing/2017/model3d" xmlns:o="urn:schemas-microsoft-com:office:office" xmlns:oel="http://schemas.microsoft.com/office/2019/extlst" xmlns:r="http://schemas.openxmlformats.org/officeDocument/2006/relationships" xmlns:m="http://schemas.openxmlformats.org/officeDocument/2006/math" xmlns:v="urn:schemas-microsoft-com:vml" xmlns:wp14="http://schemas.microsoft.com/office/word/2010/wordprocessingDrawing" xmlns:wp="http://schemas.openxmlformats.org/drawingml/2006/wordprocessingDrawing" xmlns:w10="urn:schemas-microsoft-com:office:word" xmlns:w="http://schemas.openxmlformats.org/wordprocessingml/2006/main" xmlns:w14="http://schemas.microsoft.com/office/word/2010/wordml" xmlns:w15="http://schemas.microsoft.com/office/word/2012/wordml" xmlns:w16cex="http://schemas.microsoft.com/office/word/2018/wordml/cex" xmlns:w16cid="http://schemas.microsoft.com/office/word/2016/wordml/cid" xmlns:w16="http://schemas.microsoft.com/office/word/2018/wordml" xmlns:w16du="http://schemas.microsoft.com/office/word/2023/wordml/word16du" xmlns:w16sdtdh="http://schemas.microsoft.com/office/word/2020/wordml/sdtdatahash" xmlns:w16sdtfl="http://schemas.microsoft.com/office/word/2024/wordml/sdtformatlock" xmlns:w16se="http://schemas.microsoft.com/office/word/2015/wordml/symex" xmlns:wpg="http://schemas.microsoft.com/office/word/2010/wordprocessingGroup" xmlns:wpi="http://schemas.microsoft.com/office/word/2010/wordprocessingInk" xmlns:wne="http://schemas.microsoft.com/office/word/2006/wordml" xmlns:wps="http://schemas.microsoft.com/office/word/2010/wordprocessingShape" mc:Ignorable="w14 w15 w16se w16cid w16 w16cex w16sdtdh w16sdtfl w16du wp14">
   <w:abstractNum w:abstractNumId="0" w15:restartNumberingAfterBreak="0">
+    <w:nsid w:val="03E87EDA"/>
+    <w:multiLevelType w:val="multilevel"/>
+    <w:tmpl w:val="A8041034"/>
+    <w:lvl w:ilvl="0">
+      <w:start w:val="1"/>
+      <w:numFmt w:val="bullet"/>
+      <w:lvlText w:val=""/>
+      <w:lvlJc w:val="left"/>
+      <w:pPr>
+        <w:tabs>
+          <w:tab w:val="num" w:pos="720"/>
+        </w:tabs>
+        <w:ind w:left="720" w:hanging="360"/>
+      </w:pPr>
+      <w:rPr>
+        <w:rFonts w:ascii="Symbol" w:hAnsi="Symbol" w:hint="default"/>
+        <w:sz w:val="20"/>
+      </w:rPr>
+    </w:lvl>
+    <w:lvl w:ilvl="1" w:tentative="1">
+      <w:start w:val="1"/>
+      <w:numFmt w:val="bullet"/>
+      <w:lvlText w:val="o"/>
+      <w:lvlJc w:val="left"/>
+      <w:pPr>
+        <w:tabs>
+          <w:tab w:val="num" w:pos="1440"/>
+        </w:tabs>
+        <w:ind w:left="1440" w:hanging="360"/>
+      </w:pPr>
+      <w:rPr>
+        <w:rFonts w:ascii="Courier New" w:hAnsi="Courier New" w:hint="default"/>
+        <w:sz w:val="20"/>
+      </w:rPr>
+    </w:lvl>
+    <w:lvl w:ilvl="2" w:tentative="1">
+      <w:start w:val="1"/>
+      <w:numFmt w:val="bullet"/>
+      <w:lvlText w:val=""/>
+      <w:lvlJc w:val="left"/>
+      <w:pPr>
+        <w:tabs>
+          <w:tab w:val="num" w:pos="2160"/>
+        </w:tabs>
+        <w:ind w:left="2160" w:hanging="360"/>
+      </w:pPr>
+      <w:rPr>
+        <w:rFonts w:ascii="Wingdings" w:hAnsi="Wingdings" w:hint="default"/>
+        <w:sz w:val="20"/>
+      </w:rPr>
+    </w:lvl>
+    <w:lvl w:ilvl="3" w:tentative="1">
+      <w:start w:val="1"/>
+      <w:numFmt w:val="bullet"/>
+      <w:lvlText w:val=""/>
+      <w:lvlJc w:val="left"/>
+      <w:pPr>
+        <w:tabs>
+          <w:tab w:val="num" w:pos="2880"/>
+        </w:tabs>
+        <w:ind w:left="2880" w:hanging="360"/>
+      </w:pPr>
+      <w:rPr>
+        <w:rFonts w:ascii="Wingdings" w:hAnsi="Wingdings" w:hint="default"/>
+        <w:sz w:val="20"/>
+      </w:rPr>
+    </w:lvl>
+    <w:lvl w:ilvl="4" w:tentative="1">
+      <w:start w:val="1"/>
+      <w:numFmt w:val="bullet"/>
+      <w:lvlText w:val=""/>
+      <w:lvlJc w:val="left"/>
+      <w:pPr>
+        <w:tabs>
+          <w:tab w:val="num" w:pos="3600"/>
+        </w:tabs>
+        <w:ind w:left="3600" w:hanging="360"/>
+      </w:pPr>
+      <w:rPr>
+        <w:rFonts w:ascii="Wingdings" w:hAnsi="Wingdings" w:hint="default"/>
+        <w:sz w:val="20"/>
+      </w:rPr>
+    </w:lvl>
+    <w:lvl w:ilvl="5" w:tentative="1">
+      <w:start w:val="1"/>
+      <w:numFmt w:val="bullet"/>
+      <w:lvlText w:val=""/>
+      <w:lvlJc w:val="left"/>
+      <w:pPr>
+        <w:tabs>
+          <w:tab w:val="num" w:pos="4320"/>
+        </w:tabs>
+        <w:ind w:left="4320" w:hanging="360"/>
+      </w:pPr>
+      <w:rPr>
+        <w:rFonts w:ascii="Wingdings" w:hAnsi="Wingdings" w:hint="default"/>
+        <w:sz w:val="20"/>
+      </w:rPr>
+    </w:lvl>
+    <w:lvl w:ilvl="6" w:tentative="1">
+      <w:start w:val="1"/>
+      <w:numFmt w:val="bullet"/>
+      <w:lvlText w:val=""/>
+      <w:lvlJc w:val="left"/>
+      <w:pPr>
+        <w:tabs>
+          <w:tab w:val="num" w:pos="5040"/>
+        </w:tabs>
+        <w:ind w:left="5040" w:hanging="360"/>
+      </w:pPr>
+      <w:rPr>
+        <w:rFonts w:ascii="Wingdings" w:hAnsi="Wingdings" w:hint="default"/>
+        <w:sz w:val="20"/>
+      </w:rPr>
+    </w:lvl>
+    <w:lvl w:ilvl="7" w:tentative="1">
+      <w:start w:val="1"/>
+      <w:numFmt w:val="bullet"/>
+      <w:lvlText w:val=""/>
+      <w:lvlJc w:val="left"/>
+      <w:pPr>
+        <w:tabs>
+          <w:tab w:val="num" w:pos="5760"/>
+        </w:tabs>
+        <w:ind w:left="5760" w:hanging="360"/>
+      </w:pPr>
+      <w:rPr>
+        <w:rFonts w:ascii="Wingdings" w:hAnsi="Wingdings" w:hint="default"/>
+        <w:sz w:val="20"/>
+      </w:rPr>
+    </w:lvl>
+    <w:lvl w:ilvl="8" w:tentative="1">
+      <w:start w:val="1"/>
+      <w:numFmt w:val="bullet"/>
+      <w:lvlText w:val=""/>
+      <w:lvlJc w:val="left"/>
+      <w:pPr>
+        <w:tabs>
+          <w:tab w:val="num" w:pos="6480"/>
+        </w:tabs>
+        <w:ind w:left="6480" w:hanging="360"/>
+      </w:pPr>
+      <w:rPr>
+        <w:rFonts w:ascii="Wingdings" w:hAnsi="Wingdings" w:hint="default"/>
+        <w:sz w:val="20"/>
+      </w:rPr>
+    </w:lvl>
+  </w:abstractNum>
+  <w:abstractNum w:abstractNumId="1" w15:restartNumberingAfterBreak="0">
+    <w:nsid w:val="25D35646"/>
+    <w:multiLevelType w:val="hybridMultilevel"/>
+    <w:tmpl w:val="E8BE4516"/>
+    <w:lvl w:ilvl="0" w:tplc="04090001">
+      <w:start w:val="1"/>
+      <w:numFmt w:val="bullet"/>
+      <w:lvlText w:val=""/>
+      <w:lvlJc w:val="left"/>
+      <w:pPr>
+        <w:ind w:left="720" w:hanging="360"/>
+      </w:pPr>
+      <w:rPr>
+        <w:rFonts w:ascii="Symbol" w:hAnsi="Symbol" w:hint="default"/>
+      </w:rPr>
+    </w:lvl>
+    <w:lvl w:ilvl="1" w:tplc="04090003" w:tentative="1">
+      <w:start w:val="1"/>
+      <w:numFmt w:val="bullet"/>
+      <w:lvlText w:val="o"/>
+      <w:lvlJc w:val="left"/>
+      <w:pPr>
+        <w:ind w:left="1440" w:hanging="360"/>
+      </w:pPr>
+      <w:rPr>
+        <w:rFonts w:ascii="Courier New" w:hAnsi="Courier New" w:cs="Courier New" w:hint="default"/>
+      </w:rPr>
+    </w:lvl>
+    <w:lvl w:ilvl="2" w:tplc="04090005" w:tentative="1">
+      <w:start w:val="1"/>
+      <w:numFmt w:val="bullet"/>
+      <w:lvlText w:val=""/>
+      <w:lvlJc w:val="left"/>
+      <w:pPr>
+        <w:ind w:left="2160" w:hanging="360"/>
+      </w:pPr>
+      <w:rPr>
+        <w:rFonts w:ascii="Wingdings" w:hAnsi="Wingdings" w:hint="default"/>
+      </w:rPr>
+    </w:lvl>
+    <w:lvl w:ilvl="3" w:tplc="04090001" w:tentative="1">
+      <w:start w:val="1"/>
+      <w:numFmt w:val="bullet"/>
+      <w:lvlText w:val=""/>
+      <w:lvlJc w:val="left"/>
+      <w:pPr>
+        <w:ind w:left="2880" w:hanging="360"/>
+      </w:pPr>
+      <w:rPr>
+        <w:rFonts w:ascii="Symbol" w:hAnsi="Symbol" w:hint="default"/>
+      </w:rPr>
+    </w:lvl>
+    <w:lvl w:ilvl="4" w:tplc="04090003" w:tentative="1">
+      <w:start w:val="1"/>
+      <w:numFmt w:val="bullet"/>
+      <w:lvlText w:val="o"/>
+      <w:lvlJc w:val="left"/>
+      <w:pPr>
+        <w:ind w:left="3600" w:hanging="360"/>
+      </w:pPr>
+      <w:rPr>
+        <w:rFonts w:ascii="Courier New" w:hAnsi="Courier New" w:cs="Courier New" w:hint="default"/>
+      </w:rPr>
+    </w:lvl>
+    <w:lvl w:ilvl="5" w:tplc="04090005" w:tentative="1">
+      <w:start w:val="1"/>
+      <w:numFmt w:val="bullet"/>
+      <w:lvlText w:val=""/>
+      <w:lvlJc w:val="left"/>
+      <w:pPr>
+        <w:ind w:left="4320" w:hanging="360"/>
+      </w:pPr>
+      <w:rPr>
+        <w:rFonts w:ascii="Wingdings" w:hAnsi="Wingdings" w:hint="default"/>
+      </w:rPr>
+    </w:lvl>
+    <w:lvl w:ilvl="6" w:tplc="04090001" w:tentative="1">
+      <w:start w:val="1"/>
+      <w:numFmt w:val="bullet"/>
+      <w:lvlText w:val=""/>
+      <w:lvlJc w:val="left"/>
+      <w:pPr>
+        <w:ind w:left="5040" w:hanging="360"/>
+      </w:pPr>
+      <w:rPr>
+        <w:rFonts w:ascii="Symbol" w:hAnsi="Symbol" w:hint="default"/>
+      </w:rPr>
+    </w:lvl>
+    <w:lvl w:ilvl="7" w:tplc="04090003" w:tentative="1">
+      <w:start w:val="1"/>
+      <w:numFmt w:val="bullet"/>
+      <w:lvlText w:val="o"/>
+      <w:lvlJc w:val="left"/>
+      <w:pPr>
+        <w:ind w:left="5760" w:hanging="360"/>
+      </w:pPr>
+      <w:rPr>
+        <w:rFonts w:ascii="Courier New" w:hAnsi="Courier New" w:cs="Courier New" w:hint="default"/>
+      </w:rPr>
+    </w:lvl>
+    <w:lvl w:ilvl="8" w:tplc="04090005" w:tentative="1">
+      <w:start w:val="1"/>
+      <w:numFmt w:val="bullet"/>
+      <w:lvlText w:val=""/>
+      <w:lvlJc w:val="left"/>
+      <w:pPr>
+        <w:ind w:left="6480" w:hanging="360"/>
+      </w:pPr>
+      <w:rPr>
+        <w:rFonts w:ascii="Wingdings" w:hAnsi="Wingdings" w:hint="default"/>
+      </w:rPr>
+    </w:lvl>
+  </w:abstractNum>
+  <w:abstractNum w:abstractNumId="2" w15:restartNumberingAfterBreak="0">
+    <w:nsid w:val="3D5E7FC1"/>
+    <w:multiLevelType w:val="hybridMultilevel"/>
+    <w:tmpl w:val="EECCC7E2"/>
+    <w:lvl w:ilvl="0" w:tplc="04090001">
+      <w:start w:val="1"/>
+      <w:numFmt w:val="bullet"/>
+      <w:lvlText w:val=""/>
+      <w:lvlJc w:val="left"/>
+      <w:pPr>
+        <w:ind w:left="720" w:hanging="360"/>
+      </w:pPr>
+      <w:rPr>
+        <w:rFonts w:ascii="Symbol" w:hAnsi="Symbol" w:hint="default"/>
+      </w:rPr>
+    </w:lvl>
+    <w:lvl w:ilvl="1" w:tplc="04090003" w:tentative="1">
+      <w:start w:val="1"/>
+      <w:numFmt w:val="bullet"/>
+      <w:lvlText w:val="o"/>
+      <w:lvlJc w:val="left"/>
+      <w:pPr>
+        <w:ind w:left="1440" w:hanging="360"/>
+      </w:pPr>
+      <w:rPr>
+        <w:rFonts w:ascii="Courier New" w:hAnsi="Courier New" w:cs="Courier New" w:hint="default"/>
+      </w:rPr>
+    </w:lvl>
+    <w:lvl w:ilvl="2" w:tplc="04090005" w:tentative="1">
+      <w:start w:val="1"/>
+      <w:numFmt w:val="bullet"/>
+      <w:lvlText w:val=""/>
+      <w:lvlJc w:val="left"/>
+      <w:pPr>
+        <w:ind w:left="2160" w:hanging="360"/>
+      </w:pPr>
+      <w:rPr>
+        <w:rFonts w:ascii="Wingdings" w:hAnsi="Wingdings" w:hint="default"/>
+      </w:rPr>
+    </w:lvl>
+    <w:lvl w:ilvl="3" w:tplc="04090001" w:tentative="1">
+      <w:start w:val="1"/>
+      <w:numFmt w:val="bullet"/>
+      <w:lvlText w:val=""/>
+      <w:lvlJc w:val="left"/>
+      <w:pPr>
+        <w:ind w:left="2880" w:hanging="360"/>
+      </w:pPr>
+      <w:rPr>
+        <w:rFonts w:ascii="Symbol" w:hAnsi="Symbol" w:hint="default"/>
+      </w:rPr>
+    </w:lvl>
+    <w:lvl w:ilvl="4" w:tplc="04090003" w:tentative="1">
+      <w:start w:val="1"/>
+      <w:numFmt w:val="bullet"/>
+      <w:lvlText w:val="o"/>
+      <w:lvlJc w:val="left"/>
+      <w:pPr>
+        <w:ind w:left="3600" w:hanging="360"/>
+      </w:pPr>
+      <w:rPr>
+        <w:rFonts w:ascii="Courier New" w:hAnsi="Courier New" w:cs="Courier New" w:hint="default"/>
+      </w:rPr>
+    </w:lvl>
+    <w:lvl w:ilvl="5" w:tplc="04090005" w:tentative="1">
+      <w:start w:val="1"/>
+      <w:numFmt w:val="bullet"/>
+      <w:lvlText w:val=""/>
+      <w:lvlJc w:val="left"/>
+      <w:pPr>
+        <w:ind w:left="4320" w:hanging="360"/>
+      </w:pPr>
+      <w:rPr>
+        <w:rFonts w:ascii="Wingdings" w:hAnsi="Wingdings" w:hint="default"/>
+      </w:rPr>
+    </w:lvl>
+    <w:lvl w:ilvl="6" w:tplc="04090001" w:tentative="1">
+      <w:start w:val="1"/>
+      <w:numFmt w:val="bullet"/>
+      <w:lvlText w:val=""/>
+      <w:lvlJc w:val="left"/>
+      <w:pPr>
+        <w:ind w:left="5040" w:hanging="360"/>
+      </w:pPr>
+      <w:rPr>
+        <w:rFonts w:ascii="Symbol" w:hAnsi="Symbol" w:hint="default"/>
+      </w:rPr>
+    </w:lvl>
+    <w:lvl w:ilvl="7" w:tplc="04090003" w:tentative="1">
+      <w:start w:val="1"/>
+      <w:numFmt w:val="bullet"/>
+      <w:lvlText w:val="o"/>
+      <w:lvlJc w:val="left"/>
+      <w:pPr>
+        <w:ind w:left="5760" w:hanging="360"/>
+      </w:pPr>
+      <w:rPr>
+        <w:rFonts w:ascii="Courier New" w:hAnsi="Courier New" w:cs="Courier New" w:hint="default"/>
+      </w:rPr>
+    </w:lvl>
+    <w:lvl w:ilvl="8" w:tplc="04090005" w:tentative="1">
+      <w:start w:val="1"/>
+      <w:numFmt w:val="bullet"/>
+      <w:lvlText w:val=""/>
+      <w:lvlJc w:val="left"/>
+      <w:pPr>
+        <w:ind w:left="6480" w:hanging="360"/>
+      </w:pPr>
+      <w:rPr>
+        <w:rFonts w:ascii="Wingdings" w:hAnsi="Wingdings" w:hint="default"/>
+      </w:rPr>
+    </w:lvl>
+  </w:abstractNum>
+  <w:abstractNum w:abstractNumId="3" w15:restartNumberingAfterBreak="0">
     <w:nsid w:val="3F625108"/>
     <w:multiLevelType w:val="hybridMultilevel"/>
     <w:tmpl w:val="56126ECA"/>
@@ -162,8 +1410,517 @@
       </w:pPr>
     </w:lvl>
   </w:abstractNum>
+  <w:abstractNum w:abstractNumId="4" w15:restartNumberingAfterBreak="0">
+    <w:nsid w:val="48DC6E35"/>
+    <w:multiLevelType w:val="multilevel"/>
+    <w:tmpl w:val="5E66D9F6"/>
+    <w:lvl w:ilvl="0">
+      <w:start w:val="1"/>
+      <w:numFmt w:val="decimal"/>
+      <w:lvlText w:val="%1."/>
+      <w:lvlJc w:val="left"/>
+      <w:pPr>
+        <w:tabs>
+          <w:tab w:val="num" w:pos="720"/>
+        </w:tabs>
+        <w:ind w:left="720" w:hanging="360"/>
+      </w:pPr>
+    </w:lvl>
+    <w:lvl w:ilvl="1" w:tentative="1">
+      <w:start w:val="1"/>
+      <w:numFmt w:val="decimal"/>
+      <w:lvlText w:val="%2."/>
+      <w:lvlJc w:val="left"/>
+      <w:pPr>
+        <w:tabs>
+          <w:tab w:val="num" w:pos="1440"/>
+        </w:tabs>
+        <w:ind w:left="1440" w:hanging="360"/>
+      </w:pPr>
+    </w:lvl>
+    <w:lvl w:ilvl="2" w:tentative="1">
+      <w:start w:val="1"/>
+      <w:numFmt w:val="decimal"/>
+      <w:lvlText w:val="%3."/>
+      <w:lvlJc w:val="left"/>
+      <w:pPr>
+        <w:tabs>
+          <w:tab w:val="num" w:pos="2160"/>
+        </w:tabs>
+        <w:ind w:left="2160" w:hanging="360"/>
+      </w:pPr>
+    </w:lvl>
+    <w:lvl w:ilvl="3" w:tentative="1">
+      <w:start w:val="1"/>
+      <w:numFmt w:val="decimal"/>
+      <w:lvlText w:val="%4."/>
+      <w:lvlJc w:val="left"/>
+      <w:pPr>
+        <w:tabs>
+          <w:tab w:val="num" w:pos="2880"/>
+        </w:tabs>
+        <w:ind w:left="2880" w:hanging="360"/>
+      </w:pPr>
+    </w:lvl>
+    <w:lvl w:ilvl="4" w:tentative="1">
+      <w:start w:val="1"/>
+      <w:numFmt w:val="decimal"/>
+      <w:lvlText w:val="%5."/>
+      <w:lvlJc w:val="left"/>
+      <w:pPr>
+        <w:tabs>
+          <w:tab w:val="num" w:pos="3600"/>
+        </w:tabs>
+        <w:ind w:left="3600" w:hanging="360"/>
+      </w:pPr>
+    </w:lvl>
+    <w:lvl w:ilvl="5" w:tentative="1">
+      <w:start w:val="1"/>
+      <w:numFmt w:val="decimal"/>
+      <w:lvlText w:val="%6."/>
+      <w:lvlJc w:val="left"/>
+      <w:pPr>
+        <w:tabs>
+          <w:tab w:val="num" w:pos="4320"/>
+        </w:tabs>
+        <w:ind w:left="4320" w:hanging="360"/>
+      </w:pPr>
+    </w:lvl>
+    <w:lvl w:ilvl="6" w:tentative="1">
+      <w:start w:val="1"/>
+      <w:numFmt w:val="decimal"/>
+      <w:lvlText w:val="%7."/>
+      <w:lvlJc w:val="left"/>
+      <w:pPr>
+        <w:tabs>
+          <w:tab w:val="num" w:pos="5040"/>
+        </w:tabs>
+        <w:ind w:left="5040" w:hanging="360"/>
+      </w:pPr>
+    </w:lvl>
+    <w:lvl w:ilvl="7" w:tentative="1">
+      <w:start w:val="1"/>
+      <w:numFmt w:val="decimal"/>
+      <w:lvlText w:val="%8."/>
+      <w:lvlJc w:val="left"/>
+      <w:pPr>
+        <w:tabs>
+          <w:tab w:val="num" w:pos="5760"/>
+        </w:tabs>
+        <w:ind w:left="5760" w:hanging="360"/>
+      </w:pPr>
+    </w:lvl>
+    <w:lvl w:ilvl="8" w:tentative="1">
+      <w:start w:val="1"/>
+      <w:numFmt w:val="decimal"/>
+      <w:lvlText w:val="%9."/>
+      <w:lvlJc w:val="left"/>
+      <w:pPr>
+        <w:tabs>
+          <w:tab w:val="num" w:pos="6480"/>
+        </w:tabs>
+        <w:ind w:left="6480" w:hanging="360"/>
+      </w:pPr>
+    </w:lvl>
+  </w:abstractNum>
+  <w:abstractNum w:abstractNumId="5" w15:restartNumberingAfterBreak="0">
+    <w:nsid w:val="53F94E43"/>
+    <w:multiLevelType w:val="multilevel"/>
+    <w:tmpl w:val="6572453E"/>
+    <w:lvl w:ilvl="0">
+      <w:start w:val="1"/>
+      <w:numFmt w:val="decimal"/>
+      <w:lvlText w:val="%1."/>
+      <w:lvlJc w:val="left"/>
+      <w:pPr>
+        <w:tabs>
+          <w:tab w:val="num" w:pos="720"/>
+        </w:tabs>
+        <w:ind w:left="720" w:hanging="360"/>
+      </w:pPr>
+    </w:lvl>
+    <w:lvl w:ilvl="1" w:tentative="1">
+      <w:start w:val="1"/>
+      <w:numFmt w:val="decimal"/>
+      <w:lvlText w:val="%2."/>
+      <w:lvlJc w:val="left"/>
+      <w:pPr>
+        <w:tabs>
+          <w:tab w:val="num" w:pos="1440"/>
+        </w:tabs>
+        <w:ind w:left="1440" w:hanging="360"/>
+      </w:pPr>
+    </w:lvl>
+    <w:lvl w:ilvl="2" w:tentative="1">
+      <w:start w:val="1"/>
+      <w:numFmt w:val="decimal"/>
+      <w:lvlText w:val="%3."/>
+      <w:lvlJc w:val="left"/>
+      <w:pPr>
+        <w:tabs>
+          <w:tab w:val="num" w:pos="2160"/>
+        </w:tabs>
+        <w:ind w:left="2160" w:hanging="360"/>
+      </w:pPr>
+    </w:lvl>
+    <w:lvl w:ilvl="3" w:tentative="1">
+      <w:start w:val="1"/>
+      <w:numFmt w:val="decimal"/>
+      <w:lvlText w:val="%4."/>
+      <w:lvlJc w:val="left"/>
+      <w:pPr>
+        <w:tabs>
+          <w:tab w:val="num" w:pos="2880"/>
+        </w:tabs>
+        <w:ind w:left="2880" w:hanging="360"/>
+      </w:pPr>
+    </w:lvl>
+    <w:lvl w:ilvl="4" w:tentative="1">
+      <w:start w:val="1"/>
+      <w:numFmt w:val="decimal"/>
+      <w:lvlText w:val="%5."/>
+      <w:lvlJc w:val="left"/>
+      <w:pPr>
+        <w:tabs>
+          <w:tab w:val="num" w:pos="3600"/>
+        </w:tabs>
+        <w:ind w:left="3600" w:hanging="360"/>
+      </w:pPr>
+    </w:lvl>
+    <w:lvl w:ilvl="5" w:tentative="1">
+      <w:start w:val="1"/>
+      <w:numFmt w:val="decimal"/>
+      <w:lvlText w:val="%6."/>
+      <w:lvlJc w:val="left"/>
+      <w:pPr>
+        <w:tabs>
+          <w:tab w:val="num" w:pos="4320"/>
+        </w:tabs>
+        <w:ind w:left="4320" w:hanging="360"/>
+      </w:pPr>
+    </w:lvl>
+    <w:lvl w:ilvl="6" w:tentative="1">
+      <w:start w:val="1"/>
+      <w:numFmt w:val="decimal"/>
+      <w:lvlText w:val="%7."/>
+      <w:lvlJc w:val="left"/>
+      <w:pPr>
+        <w:tabs>
+          <w:tab w:val="num" w:pos="5040"/>
+        </w:tabs>
+        <w:ind w:left="5040" w:hanging="360"/>
+      </w:pPr>
+    </w:lvl>
+    <w:lvl w:ilvl="7" w:tentative="1">
+      <w:start w:val="1"/>
+      <w:numFmt w:val="decimal"/>
+      <w:lvlText w:val="%8."/>
+      <w:lvlJc w:val="left"/>
+      <w:pPr>
+        <w:tabs>
+          <w:tab w:val="num" w:pos="5760"/>
+        </w:tabs>
+        <w:ind w:left="5760" w:hanging="360"/>
+      </w:pPr>
+    </w:lvl>
+    <w:lvl w:ilvl="8" w:tentative="1">
+      <w:start w:val="1"/>
+      <w:numFmt w:val="decimal"/>
+      <w:lvlText w:val="%9."/>
+      <w:lvlJc w:val="left"/>
+      <w:pPr>
+        <w:tabs>
+          <w:tab w:val="num" w:pos="6480"/>
+        </w:tabs>
+        <w:ind w:left="6480" w:hanging="360"/>
+      </w:pPr>
+    </w:lvl>
+  </w:abstractNum>
+  <w:abstractNum w:abstractNumId="6" w15:restartNumberingAfterBreak="0">
+    <w:nsid w:val="547310ED"/>
+    <w:multiLevelType w:val="multilevel"/>
+    <w:tmpl w:val="143E0514"/>
+    <w:lvl w:ilvl="0">
+      <w:start w:val="1"/>
+      <w:numFmt w:val="decimal"/>
+      <w:lvlText w:val="%1."/>
+      <w:lvlJc w:val="left"/>
+      <w:pPr>
+        <w:tabs>
+          <w:tab w:val="num" w:pos="720"/>
+        </w:tabs>
+        <w:ind w:left="720" w:hanging="360"/>
+      </w:pPr>
+    </w:lvl>
+    <w:lvl w:ilvl="1" w:tentative="1">
+      <w:start w:val="1"/>
+      <w:numFmt w:val="decimal"/>
+      <w:lvlText w:val="%2."/>
+      <w:lvlJc w:val="left"/>
+      <w:pPr>
+        <w:tabs>
+          <w:tab w:val="num" w:pos="1440"/>
+        </w:tabs>
+        <w:ind w:left="1440" w:hanging="360"/>
+      </w:pPr>
+    </w:lvl>
+    <w:lvl w:ilvl="2" w:tentative="1">
+      <w:start w:val="1"/>
+      <w:numFmt w:val="decimal"/>
+      <w:lvlText w:val="%3."/>
+      <w:lvlJc w:val="left"/>
+      <w:pPr>
+        <w:tabs>
+          <w:tab w:val="num" w:pos="2160"/>
+        </w:tabs>
+        <w:ind w:left="2160" w:hanging="360"/>
+      </w:pPr>
+    </w:lvl>
+    <w:lvl w:ilvl="3" w:tentative="1">
+      <w:start w:val="1"/>
+      <w:numFmt w:val="decimal"/>
+      <w:lvlText w:val="%4."/>
+      <w:lvlJc w:val="left"/>
+      <w:pPr>
+        <w:tabs>
+          <w:tab w:val="num" w:pos="2880"/>
+        </w:tabs>
+        <w:ind w:left="2880" w:hanging="360"/>
+      </w:pPr>
+    </w:lvl>
+    <w:lvl w:ilvl="4" w:tentative="1">
+      <w:start w:val="1"/>
+      <w:numFmt w:val="decimal"/>
+      <w:lvlText w:val="%5."/>
+      <w:lvlJc w:val="left"/>
+      <w:pPr>
+        <w:tabs>
+          <w:tab w:val="num" w:pos="3600"/>
+        </w:tabs>
+        <w:ind w:left="3600" w:hanging="360"/>
+      </w:pPr>
+    </w:lvl>
+    <w:lvl w:ilvl="5" w:tentative="1">
+      <w:start w:val="1"/>
+      <w:numFmt w:val="decimal"/>
+      <w:lvlText w:val="%6."/>
+      <w:lvlJc w:val="left"/>
+      <w:pPr>
+        <w:tabs>
+          <w:tab w:val="num" w:pos="4320"/>
+        </w:tabs>
+        <w:ind w:left="4320" w:hanging="360"/>
+      </w:pPr>
+    </w:lvl>
+    <w:lvl w:ilvl="6" w:tentative="1">
+      <w:start w:val="1"/>
+      <w:numFmt w:val="decimal"/>
+      <w:lvlText w:val="%7."/>
+      <w:lvlJc w:val="left"/>
+      <w:pPr>
+        <w:tabs>
+          <w:tab w:val="num" w:pos="5040"/>
+        </w:tabs>
+        <w:ind w:left="5040" w:hanging="360"/>
+      </w:pPr>
+    </w:lvl>
+    <w:lvl w:ilvl="7" w:tentative="1">
+      <w:start w:val="1"/>
+      <w:numFmt w:val="decimal"/>
+      <w:lvlText w:val="%8."/>
+      <w:lvlJc w:val="left"/>
+      <w:pPr>
+        <w:tabs>
+          <w:tab w:val="num" w:pos="5760"/>
+        </w:tabs>
+        <w:ind w:left="5760" w:hanging="360"/>
+      </w:pPr>
+    </w:lvl>
+    <w:lvl w:ilvl="8" w:tentative="1">
+      <w:start w:val="1"/>
+      <w:numFmt w:val="decimal"/>
+      <w:lvlText w:val="%9."/>
+      <w:lvlJc w:val="left"/>
+      <w:pPr>
+        <w:tabs>
+          <w:tab w:val="num" w:pos="6480"/>
+        </w:tabs>
+        <w:ind w:left="6480" w:hanging="360"/>
+      </w:pPr>
+    </w:lvl>
+  </w:abstractNum>
+  <w:abstractNum w:abstractNumId="7" w15:restartNumberingAfterBreak="0">
+    <w:nsid w:val="703C100F"/>
+    <w:multiLevelType w:val="multilevel"/>
+    <w:tmpl w:val="9FBC8F06"/>
+    <w:lvl w:ilvl="0">
+      <w:start w:val="1"/>
+      <w:numFmt w:val="bullet"/>
+      <w:lvlText w:val=""/>
+      <w:lvlJc w:val="left"/>
+      <w:pPr>
+        <w:tabs>
+          <w:tab w:val="num" w:pos="720"/>
+        </w:tabs>
+        <w:ind w:left="720" w:hanging="360"/>
+      </w:pPr>
+      <w:rPr>
+        <w:rFonts w:ascii="Symbol" w:hAnsi="Symbol" w:hint="default"/>
+        <w:sz w:val="20"/>
+      </w:rPr>
+    </w:lvl>
+    <w:lvl w:ilvl="1" w:tentative="1">
+      <w:start w:val="1"/>
+      <w:numFmt w:val="bullet"/>
+      <w:lvlText w:val="o"/>
+      <w:lvlJc w:val="left"/>
+      <w:pPr>
+        <w:tabs>
+          <w:tab w:val="num" w:pos="1440"/>
+        </w:tabs>
+        <w:ind w:left="1440" w:hanging="360"/>
+      </w:pPr>
+      <w:rPr>
+        <w:rFonts w:ascii="Courier New" w:hAnsi="Courier New" w:hint="default"/>
+        <w:sz w:val="20"/>
+      </w:rPr>
+    </w:lvl>
+    <w:lvl w:ilvl="2" w:tentative="1">
+      <w:start w:val="1"/>
+      <w:numFmt w:val="bullet"/>
+      <w:lvlText w:val=""/>
+      <w:lvlJc w:val="left"/>
+      <w:pPr>
+        <w:tabs>
+          <w:tab w:val="num" w:pos="2160"/>
+        </w:tabs>
+        <w:ind w:left="2160" w:hanging="360"/>
+      </w:pPr>
+      <w:rPr>
+        <w:rFonts w:ascii="Wingdings" w:hAnsi="Wingdings" w:hint="default"/>
+        <w:sz w:val="20"/>
+      </w:rPr>
+    </w:lvl>
+    <w:lvl w:ilvl="3" w:tentative="1">
+      <w:start w:val="1"/>
+      <w:numFmt w:val="bullet"/>
+      <w:lvlText w:val=""/>
+      <w:lvlJc w:val="left"/>
+      <w:pPr>
+        <w:tabs>
+          <w:tab w:val="num" w:pos="2880"/>
+        </w:tabs>
+        <w:ind w:left="2880" w:hanging="360"/>
+      </w:pPr>
+      <w:rPr>
+        <w:rFonts w:ascii="Wingdings" w:hAnsi="Wingdings" w:hint="default"/>
+        <w:sz w:val="20"/>
+      </w:rPr>
+    </w:lvl>
+    <w:lvl w:ilvl="4" w:tentative="1">
+      <w:start w:val="1"/>
+      <w:numFmt w:val="bullet"/>
+      <w:lvlText w:val=""/>
+      <w:lvlJc w:val="left"/>
+      <w:pPr>
+        <w:tabs>
+          <w:tab w:val="num" w:pos="3600"/>
+        </w:tabs>
+        <w:ind w:left="3600" w:hanging="360"/>
+      </w:pPr>
+      <w:rPr>
+        <w:rFonts w:ascii="Wingdings" w:hAnsi="Wingdings" w:hint="default"/>
+        <w:sz w:val="20"/>
+      </w:rPr>
+    </w:lvl>
+    <w:lvl w:ilvl="5" w:tentative="1">
+      <w:start w:val="1"/>
+      <w:numFmt w:val="bullet"/>
+      <w:lvlText w:val=""/>
+      <w:lvlJc w:val="left"/>
+      <w:pPr>
+        <w:tabs>
+          <w:tab w:val="num" w:pos="4320"/>
+        </w:tabs>
+        <w:ind w:left="4320" w:hanging="360"/>
+      </w:pPr>
+      <w:rPr>
+        <w:rFonts w:ascii="Wingdings" w:hAnsi="Wingdings" w:hint="default"/>
+        <w:sz w:val="20"/>
+      </w:rPr>
+    </w:lvl>
+    <w:lvl w:ilvl="6" w:tentative="1">
+      <w:start w:val="1"/>
+      <w:numFmt w:val="bullet"/>
+      <w:lvlText w:val=""/>
+      <w:lvlJc w:val="left"/>
+      <w:pPr>
+        <w:tabs>
+          <w:tab w:val="num" w:pos="5040"/>
+        </w:tabs>
+        <w:ind w:left="5040" w:hanging="360"/>
+      </w:pPr>
+      <w:rPr>
+        <w:rFonts w:ascii="Wingdings" w:hAnsi="Wingdings" w:hint="default"/>
+        <w:sz w:val="20"/>
+      </w:rPr>
+    </w:lvl>
+    <w:lvl w:ilvl="7" w:tentative="1">
+      <w:start w:val="1"/>
+      <w:numFmt w:val="bullet"/>
+      <w:lvlText w:val=""/>
+      <w:lvlJc w:val="left"/>
+      <w:pPr>
+        <w:tabs>
+          <w:tab w:val="num" w:pos="5760"/>
+        </w:tabs>
+        <w:ind w:left="5760" w:hanging="360"/>
+      </w:pPr>
+      <w:rPr>
+        <w:rFonts w:ascii="Wingdings" w:hAnsi="Wingdings" w:hint="default"/>
+        <w:sz w:val="20"/>
+      </w:rPr>
+    </w:lvl>
+    <w:lvl w:ilvl="8" w:tentative="1">
+      <w:start w:val="1"/>
+      <w:numFmt w:val="bullet"/>
+      <w:lvlText w:val=""/>
+      <w:lvlJc w:val="left"/>
+      <w:pPr>
+        <w:tabs>
+          <w:tab w:val="num" w:pos="6480"/>
+        </w:tabs>
+        <w:ind w:left="6480" w:hanging="360"/>
+      </w:pPr>
+      <w:rPr>
+        <w:rFonts w:ascii="Wingdings" w:hAnsi="Wingdings" w:hint="default"/>
+        <w:sz w:val="20"/>
+      </w:rPr>
+    </w:lvl>
+  </w:abstractNum>
   <w:num w:numId="1" w16cid:durableId="2064140109">
+    <w:abstractNumId w:val="3"/>
+  </w:num>
+  <w:num w:numId="2" w16cid:durableId="2045011593">
     <w:abstractNumId w:val="0"/>
+  </w:num>
+  <w:num w:numId="3" w16cid:durableId="1706248986">
+    <w:abstractNumId w:val="5"/>
+  </w:num>
+  <w:num w:numId="4" w16cid:durableId="685209948">
+    <w:abstractNumId w:val="7"/>
+  </w:num>
+  <w:num w:numId="5" w16cid:durableId="726537687">
+    <w:abstractNumId w:val="4"/>
+  </w:num>
+  <w:num w:numId="6" w16cid:durableId="401102314">
+    <w:abstractNumId w:val="6"/>
+  </w:num>
+  <w:num w:numId="7" w16cid:durableId="959342523">
+    <w:abstractNumId w:val="2"/>
+  </w:num>
+  <w:num w:numId="8" w16cid:durableId="1470130563">
+    <w:abstractNumId w:val="1"/>
   </w:num>
 </w:numbering>
 </file>
@@ -771,7 +2528,6 @@
   <w:style w:type="character" w:default="1" w:styleId="DefaultParagraphFont">
     <w:name w:val="Default Paragraph Font"/>
     <w:uiPriority w:val="1"/>
-    <w:semiHidden/>
     <w:unhideWhenUsed/>
   </w:style>
   <w:style w:type="table" w:default="1" w:styleId="TableNormal">

</xml_diff>

<commit_message>
Complete Project 6 Phase 4 with alarms, budget, and destroy practice.
Codify SNS alerts, CloudWatch alarms, and a  budget so observability guardrails redeploy with the stack.

Co-authored-by: Cursor <cursoragent@cursor.com>
</commit_message>
<xml_diff>
--- a/project-6-secure-containers/docs/Project 6 - What was Implemented.docx
+++ b/project-6-secure-containers/docs/Project 6 - What was Implemented.docx
@@ -65,6 +65,7 @@
               <w:tab w:val="right" w:leader="dot" w:pos="9350"/>
             </w:tabs>
             <w:rPr>
+              <w:rFonts w:eastAsiaTheme="minorEastAsia"/>
               <w:noProof/>
             </w:rPr>
           </w:pPr>
@@ -77,7 +78,7 @@
           <w:r>
             <w:fldChar w:fldCharType="separate"/>
           </w:r>
-          <w:hyperlink w:anchor="_Toc241979433" w:history="1">
+          <w:hyperlink w:anchor="_Toc242045001" w:history="1">
             <w:r>
               <w:rPr>
                 <w:rStyle w:val="Hyperlink"/>
@@ -104,7 +105,7 @@
                 <w:noProof/>
                 <w:webHidden/>
               </w:rPr>
-              <w:instrText xml:space="preserve"> PAGEREF _Toc241979433 \h </w:instrText>
+              <w:instrText xml:space="preserve"> PAGEREF _Toc242045001 \h </w:instrText>
             </w:r>
             <w:r>
               <w:rPr>
@@ -142,10 +143,11 @@
               <w:tab w:val="right" w:leader="dot" w:pos="9350"/>
             </w:tabs>
             <w:rPr>
+              <w:rFonts w:eastAsiaTheme="minorEastAsia"/>
               <w:noProof/>
             </w:rPr>
           </w:pPr>
-          <w:hyperlink w:anchor="_Toc241979434" w:history="1">
+          <w:hyperlink w:anchor="_Toc242045002" w:history="1">
             <w:r>
               <w:rPr>
                 <w:rStyle w:val="Hyperlink"/>
@@ -172,7 +174,7 @@
                 <w:noProof/>
                 <w:webHidden/>
               </w:rPr>
-              <w:instrText xml:space="preserve"> PAGEREF _Toc241979434 \h </w:instrText>
+              <w:instrText xml:space="preserve"> PAGEREF _Toc242045002 \h </w:instrText>
             </w:r>
             <w:r>
               <w:rPr>
@@ -210,10 +212,11 @@
               <w:tab w:val="right" w:leader="dot" w:pos="9350"/>
             </w:tabs>
             <w:rPr>
+              <w:rFonts w:eastAsiaTheme="minorEastAsia"/>
               <w:noProof/>
             </w:rPr>
           </w:pPr>
-          <w:hyperlink w:anchor="_Toc241979435" w:history="1">
+          <w:hyperlink w:anchor="_Toc242045003" w:history="1">
             <w:r>
               <w:rPr>
                 <w:rStyle w:val="Hyperlink"/>
@@ -240,7 +243,7 @@
                 <w:noProof/>
                 <w:webHidden/>
               </w:rPr>
-              <w:instrText xml:space="preserve"> PAGEREF _Toc241979435 \h </w:instrText>
+              <w:instrText xml:space="preserve"> PAGEREF _Toc242045003 \h </w:instrText>
             </w:r>
             <w:r>
               <w:rPr>
@@ -278,10 +281,11 @@
               <w:tab w:val="right" w:leader="dot" w:pos="9350"/>
             </w:tabs>
             <w:rPr>
+              <w:rFonts w:eastAsiaTheme="minorEastAsia"/>
               <w:noProof/>
             </w:rPr>
           </w:pPr>
-          <w:hyperlink w:anchor="_Toc241979436" w:history="1">
+          <w:hyperlink w:anchor="_Toc242045004" w:history="1">
             <w:r>
               <w:rPr>
                 <w:rStyle w:val="Hyperlink"/>
@@ -308,7 +312,7 @@
                 <w:noProof/>
                 <w:webHidden/>
               </w:rPr>
-              <w:instrText xml:space="preserve"> PAGEREF _Toc241979436 \h </w:instrText>
+              <w:instrText xml:space="preserve"> PAGEREF _Toc242045004 \h </w:instrText>
             </w:r>
             <w:r>
               <w:rPr>
@@ -328,7 +332,7 @@
                 <w:noProof/>
                 <w:webHidden/>
               </w:rPr>
-              <w:t>2</w:t>
+              <w:t>3</w:t>
             </w:r>
             <w:r>
               <w:rPr>
@@ -346,10 +350,11 @@
               <w:tab w:val="right" w:leader="dot" w:pos="9350"/>
             </w:tabs>
             <w:rPr>
+              <w:rFonts w:eastAsiaTheme="minorEastAsia"/>
               <w:noProof/>
             </w:rPr>
           </w:pPr>
-          <w:hyperlink w:anchor="_Toc241979437" w:history="1">
+          <w:hyperlink w:anchor="_Toc242045005" w:history="1">
             <w:r>
               <w:rPr>
                 <w:rStyle w:val="Hyperlink"/>
@@ -376,7 +381,7 @@
                 <w:noProof/>
                 <w:webHidden/>
               </w:rPr>
-              <w:instrText xml:space="preserve"> PAGEREF _Toc241979437 \h </w:instrText>
+              <w:instrText xml:space="preserve"> PAGEREF _Toc242045005 \h </w:instrText>
             </w:r>
             <w:r>
               <w:rPr>
@@ -414,10 +419,11 @@
               <w:tab w:val="right" w:leader="dot" w:pos="9350"/>
             </w:tabs>
             <w:rPr>
+              <w:rFonts w:eastAsiaTheme="minorEastAsia"/>
               <w:noProof/>
             </w:rPr>
           </w:pPr>
-          <w:hyperlink w:anchor="_Toc241979438" w:history="1">
+          <w:hyperlink w:anchor="_Toc242045006" w:history="1">
             <w:r>
               <w:rPr>
                 <w:rStyle w:val="Hyperlink"/>
@@ -444,7 +450,7 @@
                 <w:noProof/>
                 <w:webHidden/>
               </w:rPr>
-              <w:instrText xml:space="preserve"> PAGEREF _Toc241979438 \h </w:instrText>
+              <w:instrText xml:space="preserve"> PAGEREF _Toc242045006 \h </w:instrText>
             </w:r>
             <w:r>
               <w:rPr>
@@ -482,10 +488,11 @@
               <w:tab w:val="right" w:leader="dot" w:pos="9350"/>
             </w:tabs>
             <w:rPr>
+              <w:rFonts w:eastAsiaTheme="minorEastAsia"/>
               <w:noProof/>
             </w:rPr>
           </w:pPr>
-          <w:hyperlink w:anchor="_Toc241979439" w:history="1">
+          <w:hyperlink w:anchor="_Toc242045007" w:history="1">
             <w:r>
               <w:rPr>
                 <w:rStyle w:val="Hyperlink"/>
@@ -512,7 +519,7 @@
                 <w:noProof/>
                 <w:webHidden/>
               </w:rPr>
-              <w:instrText xml:space="preserve"> PAGEREF _Toc241979439 \h </w:instrText>
+              <w:instrText xml:space="preserve"> PAGEREF _Toc242045007 \h </w:instrText>
             </w:r>
             <w:r>
               <w:rPr>
@@ -550,10 +557,11 @@
               <w:tab w:val="right" w:leader="dot" w:pos="9350"/>
             </w:tabs>
             <w:rPr>
+              <w:rFonts w:eastAsiaTheme="minorEastAsia"/>
               <w:noProof/>
             </w:rPr>
           </w:pPr>
-          <w:hyperlink w:anchor="_Toc241979440" w:history="1">
+          <w:hyperlink w:anchor="_Toc242045008" w:history="1">
             <w:r>
               <w:rPr>
                 <w:rStyle w:val="Hyperlink"/>
@@ -580,7 +588,7 @@
                 <w:noProof/>
                 <w:webHidden/>
               </w:rPr>
-              <w:instrText xml:space="preserve"> PAGEREF _Toc241979440 \h </w:instrText>
+              <w:instrText xml:space="preserve"> PAGEREF _Toc242045008 \h </w:instrText>
             </w:r>
             <w:r>
               <w:rPr>
@@ -618,10 +626,11 @@
               <w:tab w:val="right" w:leader="dot" w:pos="9350"/>
             </w:tabs>
             <w:rPr>
+              <w:rFonts w:eastAsiaTheme="minorEastAsia"/>
               <w:noProof/>
             </w:rPr>
           </w:pPr>
-          <w:hyperlink w:anchor="_Toc241979441" w:history="1">
+          <w:hyperlink w:anchor="_Toc242045009" w:history="1">
             <w:r>
               <w:rPr>
                 <w:rStyle w:val="Hyperlink"/>
@@ -648,7 +657,7 @@
                 <w:noProof/>
                 <w:webHidden/>
               </w:rPr>
-              <w:instrText xml:space="preserve"> PAGEREF _Toc241979441 \h </w:instrText>
+              <w:instrText xml:space="preserve"> PAGEREF _Toc242045009 \h </w:instrText>
             </w:r>
             <w:r>
               <w:rPr>
@@ -668,7 +677,7 @@
                 <w:noProof/>
                 <w:webHidden/>
               </w:rPr>
-              <w:t>3</w:t>
+              <w:t>4</w:t>
             </w:r>
             <w:r>
               <w:rPr>
@@ -686,10 +695,11 @@
               <w:tab w:val="right" w:leader="dot" w:pos="9350"/>
             </w:tabs>
             <w:rPr>
+              <w:rFonts w:eastAsiaTheme="minorEastAsia"/>
               <w:noProof/>
             </w:rPr>
           </w:pPr>
-          <w:hyperlink w:anchor="_Toc241979442" w:history="1">
+          <w:hyperlink w:anchor="_Toc242045010" w:history="1">
             <w:r>
               <w:rPr>
                 <w:rStyle w:val="Hyperlink"/>
@@ -716,7 +726,7 @@
                 <w:noProof/>
                 <w:webHidden/>
               </w:rPr>
-              <w:instrText xml:space="preserve"> PAGEREF _Toc241979442 \h </w:instrText>
+              <w:instrText xml:space="preserve"> PAGEREF _Toc242045010 \h </w:instrText>
             </w:r>
             <w:r>
               <w:rPr>
@@ -736,7 +746,7 @@
                 <w:noProof/>
                 <w:webHidden/>
               </w:rPr>
-              <w:t>3</w:t>
+              <w:t>4</w:t>
             </w:r>
             <w:r>
               <w:rPr>
@@ -754,10 +764,11 @@
               <w:tab w:val="right" w:leader="dot" w:pos="9350"/>
             </w:tabs>
             <w:rPr>
+              <w:rFonts w:eastAsiaTheme="minorEastAsia"/>
               <w:noProof/>
             </w:rPr>
           </w:pPr>
-          <w:hyperlink w:anchor="_Toc241979443" w:history="1">
+          <w:hyperlink w:anchor="_Toc242045011" w:history="1">
             <w:r>
               <w:rPr>
                 <w:rStyle w:val="Hyperlink"/>
@@ -784,7 +795,7 @@
                 <w:noProof/>
                 <w:webHidden/>
               </w:rPr>
-              <w:instrText xml:space="preserve"> PAGEREF _Toc241979443 \h </w:instrText>
+              <w:instrText xml:space="preserve"> PAGEREF _Toc242045011 \h </w:instrText>
             </w:r>
             <w:r>
               <w:rPr>
@@ -822,10 +833,11 @@
               <w:tab w:val="right" w:leader="dot" w:pos="9350"/>
             </w:tabs>
             <w:rPr>
+              <w:rFonts w:eastAsiaTheme="minorEastAsia"/>
               <w:noProof/>
             </w:rPr>
           </w:pPr>
-          <w:hyperlink w:anchor="_Toc241979444" w:history="1">
+          <w:hyperlink w:anchor="_Toc242045012" w:history="1">
             <w:r>
               <w:rPr>
                 <w:rStyle w:val="Hyperlink"/>
@@ -852,7 +864,7 @@
                 <w:noProof/>
                 <w:webHidden/>
               </w:rPr>
-              <w:instrText xml:space="preserve"> PAGEREF _Toc241979444 \h </w:instrText>
+              <w:instrText xml:space="preserve"> PAGEREF _Toc242045012 \h </w:instrText>
             </w:r>
             <w:r>
               <w:rPr>
@@ -890,10 +902,11 @@
               <w:tab w:val="right" w:leader="dot" w:pos="9350"/>
             </w:tabs>
             <w:rPr>
+              <w:rFonts w:eastAsiaTheme="minorEastAsia"/>
               <w:noProof/>
             </w:rPr>
           </w:pPr>
-          <w:hyperlink w:anchor="_Toc241979445" w:history="1">
+          <w:hyperlink w:anchor="_Toc242045013" w:history="1">
             <w:r>
               <w:rPr>
                 <w:rStyle w:val="Hyperlink"/>
@@ -920,7 +933,7 @@
                 <w:noProof/>
                 <w:webHidden/>
               </w:rPr>
-              <w:instrText xml:space="preserve"> PAGEREF _Toc241979445 \h </w:instrText>
+              <w:instrText xml:space="preserve"> PAGEREF _Toc242045013 \h </w:instrText>
             </w:r>
             <w:r>
               <w:rPr>
@@ -958,10 +971,11 @@
               <w:tab w:val="right" w:leader="dot" w:pos="9350"/>
             </w:tabs>
             <w:rPr>
+              <w:rFonts w:eastAsiaTheme="minorEastAsia"/>
               <w:noProof/>
             </w:rPr>
           </w:pPr>
-          <w:hyperlink w:anchor="_Toc241979446" w:history="1">
+          <w:hyperlink w:anchor="_Toc242045014" w:history="1">
             <w:r>
               <w:rPr>
                 <w:rStyle w:val="Hyperlink"/>
@@ -988,7 +1002,7 @@
                 <w:noProof/>
                 <w:webHidden/>
               </w:rPr>
-              <w:instrText xml:space="preserve"> PAGEREF _Toc241979446 \h </w:instrText>
+              <w:instrText xml:space="preserve"> PAGEREF _Toc242045014 \h </w:instrText>
             </w:r>
             <w:r>
               <w:rPr>
@@ -1008,7 +1022,7 @@
                 <w:noProof/>
                 <w:webHidden/>
               </w:rPr>
-              <w:t>4</w:t>
+              <w:t>5</w:t>
             </w:r>
             <w:r>
               <w:rPr>
@@ -1026,10 +1040,11 @@
               <w:tab w:val="right" w:leader="dot" w:pos="9350"/>
             </w:tabs>
             <w:rPr>
+              <w:rFonts w:eastAsiaTheme="minorEastAsia"/>
               <w:noProof/>
             </w:rPr>
           </w:pPr>
-          <w:hyperlink w:anchor="_Toc241979447" w:history="1">
+          <w:hyperlink w:anchor="_Toc242045015" w:history="1">
             <w:r>
               <w:rPr>
                 <w:rStyle w:val="Hyperlink"/>
@@ -1056,7 +1071,7 @@
                 <w:noProof/>
                 <w:webHidden/>
               </w:rPr>
-              <w:instrText xml:space="preserve"> PAGEREF _Toc241979447 \h </w:instrText>
+              <w:instrText xml:space="preserve"> PAGEREF _Toc242045015 \h </w:instrText>
             </w:r>
             <w:r>
               <w:rPr>
@@ -1076,7 +1091,7 @@
                 <w:noProof/>
                 <w:webHidden/>
               </w:rPr>
-              <w:t>4</w:t>
+              <w:t>5</w:t>
             </w:r>
             <w:r>
               <w:rPr>
@@ -1094,10 +1109,11 @@
               <w:tab w:val="right" w:leader="dot" w:pos="9350"/>
             </w:tabs>
             <w:rPr>
+              <w:rFonts w:eastAsiaTheme="minorEastAsia"/>
               <w:noProof/>
             </w:rPr>
           </w:pPr>
-          <w:hyperlink w:anchor="_Toc241979448" w:history="1">
+          <w:hyperlink w:anchor="_Toc242045016" w:history="1">
             <w:r>
               <w:rPr>
                 <w:rStyle w:val="Hyperlink"/>
@@ -1124,7 +1140,7 @@
                 <w:noProof/>
                 <w:webHidden/>
               </w:rPr>
-              <w:instrText xml:space="preserve"> PAGEREF _Toc241979448 \h </w:instrText>
+              <w:instrText xml:space="preserve"> PAGEREF _Toc242045016 \h </w:instrText>
             </w:r>
             <w:r>
               <w:rPr>
@@ -1144,7 +1160,7 @@
                 <w:noProof/>
                 <w:webHidden/>
               </w:rPr>
-              <w:t>4</w:t>
+              <w:t>5</w:t>
             </w:r>
             <w:r>
               <w:rPr>
@@ -1162,10 +1178,11 @@
               <w:tab w:val="right" w:leader="dot" w:pos="9350"/>
             </w:tabs>
             <w:rPr>
+              <w:rFonts w:eastAsiaTheme="minorEastAsia"/>
               <w:noProof/>
             </w:rPr>
           </w:pPr>
-          <w:hyperlink w:anchor="_Toc241979449" w:history="1">
+          <w:hyperlink w:anchor="_Toc242045017" w:history="1">
             <w:r>
               <w:rPr>
                 <w:rStyle w:val="Hyperlink"/>
@@ -1192,7 +1209,7 @@
                 <w:noProof/>
                 <w:webHidden/>
               </w:rPr>
-              <w:instrText xml:space="preserve"> PAGEREF _Toc241979449 \h </w:instrText>
+              <w:instrText xml:space="preserve"> PAGEREF _Toc242045017 \h </w:instrText>
             </w:r>
             <w:r>
               <w:rPr>
@@ -1212,7 +1229,7 @@
                 <w:noProof/>
                 <w:webHidden/>
               </w:rPr>
-              <w:t>4</w:t>
+              <w:t>5</w:t>
             </w:r>
             <w:r>
               <w:rPr>
@@ -1230,10 +1247,11 @@
               <w:tab w:val="right" w:leader="dot" w:pos="9350"/>
             </w:tabs>
             <w:rPr>
+              <w:rFonts w:eastAsiaTheme="minorEastAsia"/>
               <w:noProof/>
             </w:rPr>
           </w:pPr>
-          <w:hyperlink w:anchor="_Toc241979450" w:history="1">
+          <w:hyperlink w:anchor="_Toc242045018" w:history="1">
             <w:r>
               <w:rPr>
                 <w:rStyle w:val="Hyperlink"/>
@@ -1260,7 +1278,7 @@
                 <w:noProof/>
                 <w:webHidden/>
               </w:rPr>
-              <w:instrText xml:space="preserve"> PAGEREF _Toc241979450 \h </w:instrText>
+              <w:instrText xml:space="preserve"> PAGEREF _Toc242045018 \h </w:instrText>
             </w:r>
             <w:r>
               <w:rPr>
@@ -1280,7 +1298,7 @@
                 <w:noProof/>
                 <w:webHidden/>
               </w:rPr>
-              <w:t>5</w:t>
+              <w:t>6</w:t>
             </w:r>
             <w:r>
               <w:rPr>
@@ -1298,10 +1316,11 @@
               <w:tab w:val="right" w:leader="dot" w:pos="9350"/>
             </w:tabs>
             <w:rPr>
+              <w:rFonts w:eastAsiaTheme="minorEastAsia"/>
               <w:noProof/>
             </w:rPr>
           </w:pPr>
-          <w:hyperlink w:anchor="_Toc241979451" w:history="1">
+          <w:hyperlink w:anchor="_Toc242045019" w:history="1">
             <w:r>
               <w:rPr>
                 <w:rStyle w:val="Hyperlink"/>
@@ -1328,7 +1347,7 @@
                 <w:noProof/>
                 <w:webHidden/>
               </w:rPr>
-              <w:instrText xml:space="preserve"> PAGEREF _Toc241979451 \h </w:instrText>
+              <w:instrText xml:space="preserve"> PAGEREF _Toc242045019 \h </w:instrText>
             </w:r>
             <w:r>
               <w:rPr>
@@ -1348,7 +1367,7 @@
                 <w:noProof/>
                 <w:webHidden/>
               </w:rPr>
-              <w:t>5</w:t>
+              <w:t>6</w:t>
             </w:r>
             <w:r>
               <w:rPr>
@@ -1366,10 +1385,11 @@
               <w:tab w:val="right" w:leader="dot" w:pos="9350"/>
             </w:tabs>
             <w:rPr>
+              <w:rFonts w:eastAsiaTheme="minorEastAsia"/>
               <w:noProof/>
             </w:rPr>
           </w:pPr>
-          <w:hyperlink w:anchor="_Toc241979452" w:history="1">
+          <w:hyperlink w:anchor="_Toc242045020" w:history="1">
             <w:r>
               <w:rPr>
                 <w:rStyle w:val="Hyperlink"/>
@@ -1396,7 +1416,7 @@
                 <w:noProof/>
                 <w:webHidden/>
               </w:rPr>
-              <w:instrText xml:space="preserve"> PAGEREF _Toc241979452 \h </w:instrText>
+              <w:instrText xml:space="preserve"> PAGEREF _Toc242045020 \h </w:instrText>
             </w:r>
             <w:r>
               <w:rPr>
@@ -1416,7 +1436,7 @@
                 <w:noProof/>
                 <w:webHidden/>
               </w:rPr>
-              <w:t>5</w:t>
+              <w:t>6</w:t>
             </w:r>
             <w:r>
               <w:rPr>
@@ -1434,10 +1454,11 @@
               <w:tab w:val="right" w:leader="dot" w:pos="9350"/>
             </w:tabs>
             <w:rPr>
+              <w:rFonts w:eastAsiaTheme="minorEastAsia"/>
               <w:noProof/>
             </w:rPr>
           </w:pPr>
-          <w:hyperlink w:anchor="_Toc241979453" w:history="1">
+          <w:hyperlink w:anchor="_Toc242045021" w:history="1">
             <w:r>
               <w:rPr>
                 <w:rStyle w:val="Hyperlink"/>
@@ -1464,7 +1485,7 @@
                 <w:noProof/>
                 <w:webHidden/>
               </w:rPr>
-              <w:instrText xml:space="preserve"> PAGEREF _Toc241979453 \h </w:instrText>
+              <w:instrText xml:space="preserve"> PAGEREF _Toc242045021 \h </w:instrText>
             </w:r>
             <w:r>
               <w:rPr>
@@ -1484,7 +1505,7 @@
                 <w:noProof/>
                 <w:webHidden/>
               </w:rPr>
-              <w:t>5</w:t>
+              <w:t>6</w:t>
             </w:r>
             <w:r>
               <w:rPr>
@@ -1502,16 +1523,17 @@
               <w:tab w:val="right" w:leader="dot" w:pos="9350"/>
             </w:tabs>
             <w:rPr>
+              <w:rFonts w:eastAsiaTheme="minorEastAsia"/>
               <w:noProof/>
             </w:rPr>
           </w:pPr>
-          <w:hyperlink w:anchor="_Toc241979454" w:history="1">
+          <w:hyperlink w:anchor="_Toc242045022" w:history="1">
             <w:r>
               <w:rPr>
                 <w:rStyle w:val="Hyperlink"/>
                 <w:noProof/>
               </w:rPr>
-              <w:t>The ALB target group is configured to call that path</w:t>
+              <w:t>The ALB target group</w:t>
             </w:r>
             <w:r>
               <w:rPr>
@@ -1532,7 +1554,7 @@
                 <w:noProof/>
                 <w:webHidden/>
               </w:rPr>
-              <w:instrText xml:space="preserve"> PAGEREF _Toc241979454 \h </w:instrText>
+              <w:instrText xml:space="preserve"> PAGEREF _Toc242045022 \h </w:instrText>
             </w:r>
             <w:r>
               <w:rPr>
@@ -1552,7 +1574,7 @@
                 <w:noProof/>
                 <w:webHidden/>
               </w:rPr>
-              <w:t>6</w:t>
+              <w:t>7</w:t>
             </w:r>
             <w:r>
               <w:rPr>
@@ -1570,10 +1592,11 @@
               <w:tab w:val="right" w:leader="dot" w:pos="9350"/>
             </w:tabs>
             <w:rPr>
+              <w:rFonts w:eastAsiaTheme="minorEastAsia"/>
               <w:noProof/>
             </w:rPr>
           </w:pPr>
-          <w:hyperlink w:anchor="_Toc241979455" w:history="1">
+          <w:hyperlink w:anchor="_Toc242045023" w:history="1">
             <w:r>
               <w:rPr>
                 <w:rStyle w:val="Hyperlink"/>
@@ -1600,7 +1623,7 @@
                 <w:noProof/>
                 <w:webHidden/>
               </w:rPr>
-              <w:instrText xml:space="preserve"> PAGEREF _Toc241979455 \h </w:instrText>
+              <w:instrText xml:space="preserve"> PAGEREF _Toc242045023 \h </w:instrText>
             </w:r>
             <w:r>
               <w:rPr>
@@ -1620,7 +1643,7 @@
                 <w:noProof/>
                 <w:webHidden/>
               </w:rPr>
-              <w:t>6</w:t>
+              <w:t>7</w:t>
             </w:r>
             <w:r>
               <w:rPr>
@@ -1638,10 +1661,11 @@
               <w:tab w:val="right" w:leader="dot" w:pos="9350"/>
             </w:tabs>
             <w:rPr>
+              <w:rFonts w:eastAsiaTheme="minorEastAsia"/>
               <w:noProof/>
             </w:rPr>
           </w:pPr>
-          <w:hyperlink w:anchor="_Toc241979456" w:history="1">
+          <w:hyperlink w:anchor="_Toc242045024" w:history="1">
             <w:r>
               <w:rPr>
                 <w:rStyle w:val="Hyperlink"/>
@@ -1668,7 +1692,7 @@
                 <w:noProof/>
                 <w:webHidden/>
               </w:rPr>
-              <w:instrText xml:space="preserve"> PAGEREF _Toc241979456 \h </w:instrText>
+              <w:instrText xml:space="preserve"> PAGEREF _Toc242045024 \h </w:instrText>
             </w:r>
             <w:r>
               <w:rPr>
@@ -1688,7 +1712,628 @@
                 <w:noProof/>
                 <w:webHidden/>
               </w:rPr>
-              <w:t>7</w:t>
+              <w:t>8</w:t>
+            </w:r>
+            <w:r>
+              <w:rPr>
+                <w:noProof/>
+                <w:webHidden/>
+              </w:rPr>
+              <w:fldChar w:fldCharType="end"/>
+            </w:r>
+          </w:hyperlink>
+        </w:p>
+        <w:p>
+          <w:pPr>
+            <w:pStyle w:val="TOC1"/>
+            <w:tabs>
+              <w:tab w:val="right" w:leader="dot" w:pos="9350"/>
+            </w:tabs>
+            <w:rPr>
+              <w:rFonts w:eastAsiaTheme="minorEastAsia"/>
+              <w:noProof/>
+            </w:rPr>
+          </w:pPr>
+          <w:hyperlink w:anchor="_Toc242045025" w:history="1">
+            <w:r>
+              <w:rPr>
+                <w:rStyle w:val="Hyperlink"/>
+                <w:noProof/>
+              </w:rPr>
+              <w:t>Phase 3 – Secrets &amp; IAM Hardening</w:t>
+            </w:r>
+            <w:r>
+              <w:rPr>
+                <w:noProof/>
+                <w:webHidden/>
+              </w:rPr>
+              <w:tab/>
+            </w:r>
+            <w:r>
+              <w:rPr>
+                <w:noProof/>
+                <w:webHidden/>
+              </w:rPr>
+              <w:fldChar w:fldCharType="begin"/>
+            </w:r>
+            <w:r>
+              <w:rPr>
+                <w:noProof/>
+                <w:webHidden/>
+              </w:rPr>
+              <w:instrText xml:space="preserve"> PAGEREF _Toc242045025 \h </w:instrText>
+            </w:r>
+            <w:r>
+              <w:rPr>
+                <w:noProof/>
+                <w:webHidden/>
+              </w:rPr>
+            </w:r>
+            <w:r>
+              <w:rPr>
+                <w:noProof/>
+                <w:webHidden/>
+              </w:rPr>
+              <w:fldChar w:fldCharType="separate"/>
+            </w:r>
+            <w:r>
+              <w:rPr>
+                <w:noProof/>
+                <w:webHidden/>
+              </w:rPr>
+              <w:t>8</w:t>
+            </w:r>
+            <w:r>
+              <w:rPr>
+                <w:noProof/>
+                <w:webHidden/>
+              </w:rPr>
+              <w:fldChar w:fldCharType="end"/>
+            </w:r>
+          </w:hyperlink>
+        </w:p>
+        <w:p>
+          <w:pPr>
+            <w:pStyle w:val="TOC2"/>
+            <w:tabs>
+              <w:tab w:val="right" w:leader="dot" w:pos="9350"/>
+            </w:tabs>
+            <w:rPr>
+              <w:rFonts w:eastAsiaTheme="minorEastAsia"/>
+              <w:noProof/>
+            </w:rPr>
+          </w:pPr>
+          <w:hyperlink w:anchor="_Toc242045026" w:history="1">
+            <w:r>
+              <w:rPr>
+                <w:rStyle w:val="Hyperlink"/>
+                <w:noProof/>
+              </w:rPr>
+              <w:t>What changed</w:t>
+            </w:r>
+            <w:r>
+              <w:rPr>
+                <w:noProof/>
+                <w:webHidden/>
+              </w:rPr>
+              <w:tab/>
+            </w:r>
+            <w:r>
+              <w:rPr>
+                <w:noProof/>
+                <w:webHidden/>
+              </w:rPr>
+              <w:fldChar w:fldCharType="begin"/>
+            </w:r>
+            <w:r>
+              <w:rPr>
+                <w:noProof/>
+                <w:webHidden/>
+              </w:rPr>
+              <w:instrText xml:space="preserve"> PAGEREF _Toc242045026 \h </w:instrText>
+            </w:r>
+            <w:r>
+              <w:rPr>
+                <w:noProof/>
+                <w:webHidden/>
+              </w:rPr>
+            </w:r>
+            <w:r>
+              <w:rPr>
+                <w:noProof/>
+                <w:webHidden/>
+              </w:rPr>
+              <w:fldChar w:fldCharType="separate"/>
+            </w:r>
+            <w:r>
+              <w:rPr>
+                <w:noProof/>
+                <w:webHidden/>
+              </w:rPr>
+              <w:t>8</w:t>
+            </w:r>
+            <w:r>
+              <w:rPr>
+                <w:noProof/>
+                <w:webHidden/>
+              </w:rPr>
+              <w:fldChar w:fldCharType="end"/>
+            </w:r>
+          </w:hyperlink>
+        </w:p>
+        <w:p>
+          <w:pPr>
+            <w:pStyle w:val="TOC1"/>
+            <w:tabs>
+              <w:tab w:val="right" w:leader="dot" w:pos="9350"/>
+            </w:tabs>
+            <w:rPr>
+              <w:rFonts w:eastAsiaTheme="minorEastAsia"/>
+              <w:noProof/>
+            </w:rPr>
+          </w:pPr>
+          <w:hyperlink w:anchor="_Toc242045027" w:history="1">
+            <w:r>
+              <w:rPr>
+                <w:rStyle w:val="Hyperlink"/>
+                <w:noProof/>
+              </w:rPr>
+              <w:t>Phase 3 end-to-end (plain English)</w:t>
+            </w:r>
+            <w:r>
+              <w:rPr>
+                <w:noProof/>
+                <w:webHidden/>
+              </w:rPr>
+              <w:tab/>
+            </w:r>
+            <w:r>
+              <w:rPr>
+                <w:noProof/>
+                <w:webHidden/>
+              </w:rPr>
+              <w:fldChar w:fldCharType="begin"/>
+            </w:r>
+            <w:r>
+              <w:rPr>
+                <w:noProof/>
+                <w:webHidden/>
+              </w:rPr>
+              <w:instrText xml:space="preserve"> PAGEREF _Toc242045027 \h </w:instrText>
+            </w:r>
+            <w:r>
+              <w:rPr>
+                <w:noProof/>
+                <w:webHidden/>
+              </w:rPr>
+            </w:r>
+            <w:r>
+              <w:rPr>
+                <w:noProof/>
+                <w:webHidden/>
+              </w:rPr>
+              <w:fldChar w:fldCharType="separate"/>
+            </w:r>
+            <w:r>
+              <w:rPr>
+                <w:noProof/>
+                <w:webHidden/>
+              </w:rPr>
+              <w:t>9</w:t>
+            </w:r>
+            <w:r>
+              <w:rPr>
+                <w:noProof/>
+                <w:webHidden/>
+              </w:rPr>
+              <w:fldChar w:fldCharType="end"/>
+            </w:r>
+          </w:hyperlink>
+        </w:p>
+        <w:p>
+          <w:pPr>
+            <w:pStyle w:val="TOC2"/>
+            <w:tabs>
+              <w:tab w:val="right" w:leader="dot" w:pos="9350"/>
+            </w:tabs>
+            <w:rPr>
+              <w:rFonts w:eastAsiaTheme="minorEastAsia"/>
+              <w:noProof/>
+            </w:rPr>
+          </w:pPr>
+          <w:hyperlink w:anchor="_Toc242045028" w:history="1">
+            <w:r>
+              <w:rPr>
+                <w:rStyle w:val="Hyperlink"/>
+                <w:noProof/>
+              </w:rPr>
+              <w:t>Problem Phase 2 had:</w:t>
+            </w:r>
+            <w:r>
+              <w:rPr>
+                <w:noProof/>
+                <w:webHidden/>
+              </w:rPr>
+              <w:tab/>
+            </w:r>
+            <w:r>
+              <w:rPr>
+                <w:noProof/>
+                <w:webHidden/>
+              </w:rPr>
+              <w:fldChar w:fldCharType="begin"/>
+            </w:r>
+            <w:r>
+              <w:rPr>
+                <w:noProof/>
+                <w:webHidden/>
+              </w:rPr>
+              <w:instrText xml:space="preserve"> PAGEREF _Toc242045028 \h </w:instrText>
+            </w:r>
+            <w:r>
+              <w:rPr>
+                <w:noProof/>
+                <w:webHidden/>
+              </w:rPr>
+            </w:r>
+            <w:r>
+              <w:rPr>
+                <w:noProof/>
+                <w:webHidden/>
+              </w:rPr>
+              <w:fldChar w:fldCharType="separate"/>
+            </w:r>
+            <w:r>
+              <w:rPr>
+                <w:noProof/>
+                <w:webHidden/>
+              </w:rPr>
+              <w:t>9</w:t>
+            </w:r>
+            <w:r>
+              <w:rPr>
+                <w:noProof/>
+                <w:webHidden/>
+              </w:rPr>
+              <w:fldChar w:fldCharType="end"/>
+            </w:r>
+          </w:hyperlink>
+        </w:p>
+        <w:p>
+          <w:pPr>
+            <w:pStyle w:val="TOC2"/>
+            <w:tabs>
+              <w:tab w:val="right" w:leader="dot" w:pos="9350"/>
+            </w:tabs>
+            <w:rPr>
+              <w:rFonts w:eastAsiaTheme="minorEastAsia"/>
+              <w:noProof/>
+            </w:rPr>
+          </w:pPr>
+          <w:hyperlink w:anchor="_Toc242045029" w:history="1">
+            <w:r>
+              <w:rPr>
+                <w:rStyle w:val="Hyperlink"/>
+                <w:noProof/>
+              </w:rPr>
+              <w:t>What Phase 3 does:</w:t>
+            </w:r>
+            <w:r>
+              <w:rPr>
+                <w:noProof/>
+                <w:webHidden/>
+              </w:rPr>
+              <w:tab/>
+            </w:r>
+            <w:r>
+              <w:rPr>
+                <w:noProof/>
+                <w:webHidden/>
+              </w:rPr>
+              <w:fldChar w:fldCharType="begin"/>
+            </w:r>
+            <w:r>
+              <w:rPr>
+                <w:noProof/>
+                <w:webHidden/>
+              </w:rPr>
+              <w:instrText xml:space="preserve"> PAGEREF _Toc242045029 \h </w:instrText>
+            </w:r>
+            <w:r>
+              <w:rPr>
+                <w:noProof/>
+                <w:webHidden/>
+              </w:rPr>
+            </w:r>
+            <w:r>
+              <w:rPr>
+                <w:noProof/>
+                <w:webHidden/>
+              </w:rPr>
+              <w:fldChar w:fldCharType="separate"/>
+            </w:r>
+            <w:r>
+              <w:rPr>
+                <w:noProof/>
+                <w:webHidden/>
+              </w:rPr>
+              <w:t>9</w:t>
+            </w:r>
+            <w:r>
+              <w:rPr>
+                <w:noProof/>
+                <w:webHidden/>
+              </w:rPr>
+              <w:fldChar w:fldCharType="end"/>
+            </w:r>
+          </w:hyperlink>
+        </w:p>
+        <w:p>
+          <w:pPr>
+            <w:pStyle w:val="TOC2"/>
+            <w:tabs>
+              <w:tab w:val="right" w:leader="dot" w:pos="9350"/>
+            </w:tabs>
+            <w:rPr>
+              <w:rFonts w:eastAsiaTheme="minorEastAsia"/>
+              <w:noProof/>
+            </w:rPr>
+          </w:pPr>
+          <w:hyperlink w:anchor="_Toc242045030" w:history="1">
+            <w:r>
+              <w:rPr>
+                <w:rStyle w:val="Hyperlink"/>
+                <w:noProof/>
+              </w:rPr>
+              <w:t>Flow</w:t>
+            </w:r>
+            <w:r>
+              <w:rPr>
+                <w:noProof/>
+                <w:webHidden/>
+              </w:rPr>
+              <w:tab/>
+            </w:r>
+            <w:r>
+              <w:rPr>
+                <w:noProof/>
+                <w:webHidden/>
+              </w:rPr>
+              <w:fldChar w:fldCharType="begin"/>
+            </w:r>
+            <w:r>
+              <w:rPr>
+                <w:noProof/>
+                <w:webHidden/>
+              </w:rPr>
+              <w:instrText xml:space="preserve"> PAGEREF _Toc242045030 \h </w:instrText>
+            </w:r>
+            <w:r>
+              <w:rPr>
+                <w:noProof/>
+                <w:webHidden/>
+              </w:rPr>
+            </w:r>
+            <w:r>
+              <w:rPr>
+                <w:noProof/>
+                <w:webHidden/>
+              </w:rPr>
+              <w:fldChar w:fldCharType="separate"/>
+            </w:r>
+            <w:r>
+              <w:rPr>
+                <w:noProof/>
+                <w:webHidden/>
+              </w:rPr>
+              <w:t>9</w:t>
+            </w:r>
+            <w:r>
+              <w:rPr>
+                <w:noProof/>
+                <w:webHidden/>
+              </w:rPr>
+              <w:fldChar w:fldCharType="end"/>
+            </w:r>
+          </w:hyperlink>
+        </w:p>
+        <w:p>
+          <w:pPr>
+            <w:pStyle w:val="TOC2"/>
+            <w:tabs>
+              <w:tab w:val="right" w:leader="dot" w:pos="9350"/>
+            </w:tabs>
+            <w:rPr>
+              <w:rFonts w:eastAsiaTheme="minorEastAsia"/>
+              <w:noProof/>
+            </w:rPr>
+          </w:pPr>
+          <w:hyperlink w:anchor="_Toc242045031" w:history="1">
+            <w:r>
+              <w:rPr>
+                <w:rStyle w:val="Hyperlink"/>
+                <w:noProof/>
+              </w:rPr>
+              <w:t>Two IAM roles (why both)</w:t>
+            </w:r>
+            <w:r>
+              <w:rPr>
+                <w:noProof/>
+                <w:webHidden/>
+              </w:rPr>
+              <w:tab/>
+            </w:r>
+            <w:r>
+              <w:rPr>
+                <w:noProof/>
+                <w:webHidden/>
+              </w:rPr>
+              <w:fldChar w:fldCharType="begin"/>
+            </w:r>
+            <w:r>
+              <w:rPr>
+                <w:noProof/>
+                <w:webHidden/>
+              </w:rPr>
+              <w:instrText xml:space="preserve"> PAGEREF _Toc242045031 \h </w:instrText>
+            </w:r>
+            <w:r>
+              <w:rPr>
+                <w:noProof/>
+                <w:webHidden/>
+              </w:rPr>
+            </w:r>
+            <w:r>
+              <w:rPr>
+                <w:noProof/>
+                <w:webHidden/>
+              </w:rPr>
+              <w:fldChar w:fldCharType="separate"/>
+            </w:r>
+            <w:r>
+              <w:rPr>
+                <w:noProof/>
+                <w:webHidden/>
+              </w:rPr>
+              <w:t>10</w:t>
+            </w:r>
+            <w:r>
+              <w:rPr>
+                <w:noProof/>
+                <w:webHidden/>
+              </w:rPr>
+              <w:fldChar w:fldCharType="end"/>
+            </w:r>
+          </w:hyperlink>
+        </w:p>
+        <w:p>
+          <w:pPr>
+            <w:pStyle w:val="TOC2"/>
+            <w:tabs>
+              <w:tab w:val="right" w:leader="dot" w:pos="9350"/>
+            </w:tabs>
+            <w:rPr>
+              <w:rFonts w:eastAsiaTheme="minorEastAsia"/>
+              <w:noProof/>
+            </w:rPr>
+          </w:pPr>
+          <w:hyperlink w:anchor="_Toc242045032" w:history="1">
+            <w:r>
+              <w:rPr>
+                <w:rStyle w:val="Hyperlink"/>
+                <w:noProof/>
+              </w:rPr>
+              <w:t>Phase 3 Takeaways</w:t>
+            </w:r>
+            <w:r>
+              <w:rPr>
+                <w:noProof/>
+                <w:webHidden/>
+              </w:rPr>
+              <w:tab/>
+            </w:r>
+            <w:r>
+              <w:rPr>
+                <w:noProof/>
+                <w:webHidden/>
+              </w:rPr>
+              <w:fldChar w:fldCharType="begin"/>
+            </w:r>
+            <w:r>
+              <w:rPr>
+                <w:noProof/>
+                <w:webHidden/>
+              </w:rPr>
+              <w:instrText xml:space="preserve"> PAGEREF _Toc242045032 \h </w:instrText>
+            </w:r>
+            <w:r>
+              <w:rPr>
+                <w:noProof/>
+                <w:webHidden/>
+              </w:rPr>
+            </w:r>
+            <w:r>
+              <w:rPr>
+                <w:noProof/>
+                <w:webHidden/>
+              </w:rPr>
+              <w:fldChar w:fldCharType="separate"/>
+            </w:r>
+            <w:r>
+              <w:rPr>
+                <w:noProof/>
+                <w:webHidden/>
+              </w:rPr>
+              <w:t>10</w:t>
+            </w:r>
+            <w:r>
+              <w:rPr>
+                <w:noProof/>
+                <w:webHidden/>
+              </w:rPr>
+              <w:fldChar w:fldCharType="end"/>
+            </w:r>
+          </w:hyperlink>
+        </w:p>
+        <w:p>
+          <w:pPr>
+            <w:pStyle w:val="TOC2"/>
+            <w:tabs>
+              <w:tab w:val="right" w:leader="dot" w:pos="9350"/>
+            </w:tabs>
+            <w:rPr>
+              <w:rFonts w:eastAsiaTheme="minorEastAsia"/>
+              <w:noProof/>
+            </w:rPr>
+          </w:pPr>
+          <w:hyperlink w:anchor="_Toc242045033" w:history="1">
+            <w:r>
+              <w:rPr>
+                <w:rStyle w:val="Hyperlink"/>
+                <w:noProof/>
+              </w:rPr>
+              <w:t>IAM Roles Configurations</w:t>
+            </w:r>
+            <w:r>
+              <w:rPr>
+                <w:noProof/>
+                <w:webHidden/>
+              </w:rPr>
+              <w:tab/>
+            </w:r>
+            <w:r>
+              <w:rPr>
+                <w:noProof/>
+                <w:webHidden/>
+              </w:rPr>
+              <w:fldChar w:fldCharType="begin"/>
+            </w:r>
+            <w:r>
+              <w:rPr>
+                <w:noProof/>
+                <w:webHidden/>
+              </w:rPr>
+              <w:instrText xml:space="preserve"> PAGEREF _Toc242045033 \h </w:instrText>
+            </w:r>
+            <w:r>
+              <w:rPr>
+                <w:noProof/>
+                <w:webHidden/>
+              </w:rPr>
+            </w:r>
+            <w:r>
+              <w:rPr>
+                <w:noProof/>
+                <w:webHidden/>
+              </w:rPr>
+              <w:fldChar w:fldCharType="separate"/>
+            </w:r>
+            <w:r>
+              <w:rPr>
+                <w:noProof/>
+                <w:webHidden/>
+              </w:rPr>
+              <w:t>10</w:t>
             </w:r>
             <w:r>
               <w:rPr>
@@ -1759,7 +2404,7 @@
           <w:szCs w:val="22"/>
         </w:rPr>
       </w:pPr>
-      <w:bookmarkStart w:id="0" w:name="_Toc241979433"/>
+      <w:bookmarkStart w:id="0" w:name="_Toc242045001"/>
       <w:r>
         <w:rPr>
           <w:sz w:val="22"/>
@@ -1844,7 +2489,7 @@
           <w:szCs w:val="22"/>
         </w:rPr>
       </w:pPr>
-      <w:bookmarkStart w:id="1" w:name="_Toc241979434"/>
+      <w:bookmarkStart w:id="1" w:name="_Toc242045002"/>
       <w:r>
         <w:rPr>
           <w:sz w:val="22"/>
@@ -2013,7 +2658,7 @@
           <w:szCs w:val="22"/>
         </w:rPr>
       </w:pPr>
-      <w:bookmarkStart w:id="2" w:name="_Toc241979435"/>
+      <w:bookmarkStart w:id="2" w:name="_Toc242045003"/>
       <w:r>
         <w:rPr>
           <w:sz w:val="22"/>
@@ -2120,12 +2765,13 @@
           <w:szCs w:val="22"/>
         </w:rPr>
       </w:pPr>
-      <w:bookmarkStart w:id="3" w:name="_Toc241979436"/>
-      <w:r>
-        <w:rPr>
-          <w:sz w:val="22"/>
-          <w:szCs w:val="22"/>
-        </w:rPr>
+      <w:bookmarkStart w:id="3" w:name="_Toc242045004"/>
+      <w:r>
+        <w:rPr>
+          <w:sz w:val="22"/>
+          <w:szCs w:val="22"/>
+        </w:rPr>
+        <w:lastRenderedPageBreak/>
         <w:t>Differences that matter</w:t>
       </w:r>
       <w:bookmarkEnd w:id="3"/>
@@ -2345,13 +2991,12 @@
           <w:szCs w:val="22"/>
         </w:rPr>
       </w:pPr>
-      <w:bookmarkStart w:id="4" w:name="_Toc241979437"/>
-      <w:r>
-        <w:rPr>
-          <w:sz w:val="22"/>
-          <w:szCs w:val="22"/>
-        </w:rPr>
-        <w:lastRenderedPageBreak/>
+      <w:bookmarkStart w:id="4" w:name="_Toc242045005"/>
+      <w:r>
+        <w:rPr>
+          <w:sz w:val="22"/>
+          <w:szCs w:val="22"/>
+        </w:rPr>
         <w:t>What Docker Desktop did</w:t>
       </w:r>
       <w:bookmarkEnd w:id="4"/>
@@ -2444,7 +3089,7 @@
           <w:szCs w:val="22"/>
         </w:rPr>
       </w:pPr>
-      <w:bookmarkStart w:id="5" w:name="_Toc241979438"/>
+      <w:bookmarkStart w:id="5" w:name="_Toc242045006"/>
       <w:r>
         <w:rPr>
           <w:sz w:val="22"/>
@@ -2478,7 +3123,7 @@
           <w:szCs w:val="22"/>
         </w:rPr>
       </w:pPr>
-      <w:bookmarkStart w:id="6" w:name="_Toc241979439"/>
+      <w:bookmarkStart w:id="6" w:name="_Toc242045007"/>
       <w:r>
         <w:rPr>
           <w:sz w:val="22"/>
@@ -2716,7 +3361,7 @@
           <w:szCs w:val="22"/>
         </w:rPr>
       </w:pPr>
-      <w:bookmarkStart w:id="7" w:name="_Toc241979440"/>
+      <w:bookmarkStart w:id="7" w:name="_Toc242045008"/>
       <w:r>
         <w:rPr>
           <w:sz w:val="22"/>
@@ -2780,6 +3425,7 @@
           <w:sz w:val="22"/>
           <w:szCs w:val="22"/>
         </w:rPr>
+        <w:lastRenderedPageBreak/>
         <w:t>That starts a container from the local image so you can hit /health and /info. Useful to prove the image works before uploading.</w:t>
       </w:r>
     </w:p>
@@ -2799,7 +3445,7 @@
           <w:szCs w:val="22"/>
         </w:rPr>
       </w:pPr>
-      <w:bookmarkStart w:id="8" w:name="_Toc241979441"/>
+      <w:bookmarkStart w:id="8" w:name="_Toc242045009"/>
       <w:r>
         <w:rPr>
           <w:sz w:val="22"/>
@@ -2874,7 +3520,7 @@
           <w:szCs w:val="22"/>
         </w:rPr>
       </w:pPr>
-      <w:bookmarkStart w:id="9" w:name="_Toc241979442"/>
+      <w:bookmarkStart w:id="9" w:name="_Toc242045010"/>
       <w:r>
         <w:rPr>
           <w:sz w:val="22"/>
@@ -2957,7 +3603,6 @@
           <w:sz w:val="22"/>
           <w:szCs w:val="22"/>
         </w:rPr>
-        <w:lastRenderedPageBreak/>
         <w:t>This gives your local Docker permission to push to your account’s registry.</w:t>
       </w:r>
     </w:p>
@@ -2969,7 +3614,7 @@
           <w:szCs w:val="22"/>
         </w:rPr>
       </w:pPr>
-      <w:bookmarkStart w:id="10" w:name="_Toc241979443"/>
+      <w:bookmarkStart w:id="10" w:name="_Toc242045011"/>
       <w:r>
         <w:rPr>
           <w:sz w:val="22"/>
@@ -3052,7 +3697,7 @@
           <w:szCs w:val="22"/>
         </w:rPr>
       </w:pPr>
-      <w:bookmarkStart w:id="11" w:name="_Toc241979444"/>
+      <w:bookmarkStart w:id="11" w:name="_Toc242045012"/>
       <w:r>
         <w:rPr>
           <w:sz w:val="22"/>
@@ -3111,7 +3756,7 @@
           <w:szCs w:val="22"/>
         </w:rPr>
       </w:pPr>
-      <w:bookmarkStart w:id="12" w:name="_Toc241979445"/>
+      <w:bookmarkStart w:id="12" w:name="_Toc242045013"/>
       <w:r>
         <w:rPr>
           <w:sz w:val="22"/>
@@ -3178,12 +3823,13 @@
           <w:szCs w:val="22"/>
         </w:rPr>
       </w:pPr>
-      <w:bookmarkStart w:id="13" w:name="_Toc241979446"/>
-      <w:r>
-        <w:rPr>
-          <w:sz w:val="22"/>
-          <w:szCs w:val="22"/>
-        </w:rPr>
+      <w:bookmarkStart w:id="13" w:name="_Toc242045014"/>
+      <w:r>
+        <w:rPr>
+          <w:sz w:val="22"/>
+          <w:szCs w:val="22"/>
+        </w:rPr>
+        <w:lastRenderedPageBreak/>
         <w:t>Phase 2</w:t>
       </w:r>
       <w:r>
@@ -3203,7 +3849,7 @@
           <w:szCs w:val="22"/>
         </w:rPr>
       </w:pPr>
-      <w:bookmarkStart w:id="14" w:name="_Toc241979447"/>
+      <w:bookmarkStart w:id="14" w:name="_Toc242045015"/>
       <w:r>
         <w:rPr>
           <w:sz w:val="22"/>
@@ -3332,7 +3978,7 @@
           <w:szCs w:val="22"/>
         </w:rPr>
       </w:pPr>
-      <w:bookmarkStart w:id="15" w:name="_Toc241979448"/>
+      <w:bookmarkStart w:id="15" w:name="_Toc242045016"/>
       <w:r>
         <w:rPr>
           <w:sz w:val="22"/>
@@ -3455,7 +4101,6 @@
           <w:sz w:val="22"/>
           <w:szCs w:val="22"/>
         </w:rPr>
-        <w:lastRenderedPageBreak/>
         <w:t>Cost: ALB + Fargate are billing while this stays up. When you’re done for the day, say if you want me to terraform destroy or scale to 0.</w:t>
       </w:r>
     </w:p>
@@ -3475,7 +4120,7 @@
           <w:szCs w:val="22"/>
         </w:rPr>
       </w:pPr>
-      <w:bookmarkStart w:id="16" w:name="_Toc241979449"/>
+      <w:bookmarkStart w:id="16" w:name="_Toc242045017"/>
       <w:r>
         <w:rPr>
           <w:sz w:val="22"/>
@@ -3536,7 +4181,7 @@
           <w:szCs w:val="22"/>
         </w:rPr>
       </w:pPr>
-      <w:bookmarkStart w:id="17" w:name="_Toc241979450"/>
+      <w:bookmarkStart w:id="17" w:name="_Toc242045018"/>
       <w:r>
         <w:rPr>
           <w:sz w:val="22"/>
@@ -3594,7 +4239,7 @@
           <w:szCs w:val="22"/>
         </w:rPr>
       </w:pPr>
-      <w:bookmarkStart w:id="18" w:name="_Toc241979451"/>
+      <w:bookmarkStart w:id="18" w:name="_Toc242045019"/>
       <w:r>
         <w:rPr>
           <w:sz w:val="22"/>
@@ -3658,7 +4303,7 @@
           <w:szCs w:val="22"/>
         </w:rPr>
       </w:pPr>
-      <w:bookmarkStart w:id="19" w:name="_Toc241979452"/>
+      <w:bookmarkStart w:id="19" w:name="_Toc242045020"/>
       <w:r>
         <w:rPr>
           <w:sz w:val="22"/>
@@ -3712,7 +4357,7 @@
           <w:szCs w:val="22"/>
         </w:rPr>
       </w:pPr>
-      <w:bookmarkStart w:id="20" w:name="_Toc241979453"/>
+      <w:bookmarkStart w:id="20" w:name="_Toc242045021"/>
       <w:r>
         <w:rPr>
           <w:sz w:val="22"/>
@@ -3811,13 +4456,13 @@
           <w:szCs w:val="22"/>
         </w:rPr>
       </w:pPr>
-      <w:bookmarkStart w:id="21" w:name="_Toc241979454"/>
-      <w:r>
-        <w:rPr>
-          <w:sz w:val="22"/>
-          <w:szCs w:val="22"/>
-        </w:rPr>
-        <w:t>The ALB target group is configured to call that path</w:t>
+      <w:bookmarkStart w:id="21" w:name="_Toc242045022"/>
+      <w:r>
+        <w:rPr>
+          <w:sz w:val="22"/>
+          <w:szCs w:val="22"/>
+        </w:rPr>
+        <w:t>The ALB target group</w:t>
       </w:r>
       <w:bookmarkEnd w:id="21"/>
     </w:p>
@@ -4027,7 +4672,7 @@
           <w:szCs w:val="22"/>
         </w:rPr>
       </w:pPr>
-      <w:bookmarkStart w:id="22" w:name="_Toc241979455"/>
+      <w:bookmarkStart w:id="22" w:name="_Toc242045023"/>
       <w:r>
         <w:rPr>
           <w:sz w:val="22"/>
@@ -4156,7 +4801,7 @@
           <w:szCs w:val="22"/>
         </w:rPr>
       </w:pPr>
-      <w:bookmarkStart w:id="23" w:name="_Toc241979456"/>
+      <w:bookmarkStart w:id="23" w:name="_Toc242045024"/>
       <w:r>
         <w:rPr>
           <w:sz w:val="22"/>
@@ -4269,6 +4914,7 @@
           <w:szCs w:val="22"/>
         </w:rPr>
       </w:pPr>
+      <w:bookmarkStart w:id="24" w:name="_Toc242045025"/>
       <w:r>
         <w:rPr>
           <w:sz w:val="22"/>
@@ -4283,6 +4929,7 @@
         </w:rPr>
         <w:t xml:space="preserve"> – Secrets &amp; IAM Hardening</w:t>
       </w:r>
+      <w:bookmarkEnd w:id="24"/>
     </w:p>
     <w:p>
       <w:pPr>
@@ -4399,11 +5046,13 @@
     </w:p>
     <w:p>
       <w:pPr>
-        <w:rPr>
-          <w:sz w:val="22"/>
-          <w:szCs w:val="22"/>
-        </w:rPr>
-      </w:pPr>
+        <w:pStyle w:val="Heading2"/>
+        <w:rPr>
+          <w:sz w:val="22"/>
+          <w:szCs w:val="22"/>
+        </w:rPr>
+      </w:pPr>
+      <w:bookmarkStart w:id="25" w:name="_Toc242045026"/>
       <w:r>
         <w:rPr>
           <w:sz w:val="22"/>
@@ -4411,6 +5060,7 @@
         </w:rPr>
         <w:t>What changed</w:t>
       </w:r>
+      <w:bookmarkEnd w:id="25"/>
     </w:p>
     <w:p>
       <w:pPr>
@@ -4542,24 +5192,351 @@
     </w:p>
     <w:p>
       <w:pPr>
-        <w:rPr>
-          <w:sz w:val="22"/>
-          <w:szCs w:val="22"/>
-        </w:rPr>
-      </w:pPr>
-      <w:r>
-        <w:rPr>
-          <w:sz w:val="22"/>
-          <w:szCs w:val="22"/>
-        </w:rPr>
-        <w:t>Console checks worth a screenshot</w:t>
-      </w:r>
-    </w:p>
-    <w:p>
-      <w:pPr>
+        <w:pStyle w:val="Heading1"/>
+        <w:rPr>
+          <w:sz w:val="22"/>
+          <w:szCs w:val="22"/>
+        </w:rPr>
+      </w:pPr>
+      <w:bookmarkStart w:id="26" w:name="_Toc242045027"/>
+      <w:r>
+        <w:rPr>
+          <w:sz w:val="22"/>
+          <w:szCs w:val="22"/>
+        </w:rPr>
+        <w:t>Phase 3 end-to-end (plain English)</w:t>
+      </w:r>
+      <w:bookmarkEnd w:id="26"/>
+    </w:p>
+    <w:p>
+      <w:pPr>
+        <w:pStyle w:val="Heading2"/>
+        <w:rPr>
+          <w:sz w:val="22"/>
+          <w:szCs w:val="22"/>
+        </w:rPr>
+      </w:pPr>
+      <w:bookmarkStart w:id="27" w:name="_Toc242045028"/>
+      <w:r>
+        <w:rPr>
+          <w:sz w:val="22"/>
+          <w:szCs w:val="22"/>
+        </w:rPr>
+        <w:t>Problem Phase 2 had:</w:t>
+      </w:r>
+      <w:bookmarkEnd w:id="27"/>
+    </w:p>
+    <w:p>
+      <w:pPr>
+        <w:rPr>
+          <w:sz w:val="22"/>
+          <w:szCs w:val="22"/>
+        </w:rPr>
+      </w:pPr>
+      <w:r>
+        <w:rPr>
+          <w:sz w:val="22"/>
+          <w:szCs w:val="22"/>
+        </w:rPr>
+        <w:t>APP_SECRET was a normal environment variable in the task definition — basically stored in plaintext in ECS config.</w:t>
+      </w:r>
+    </w:p>
+    <w:p>
+      <w:pPr>
+        <w:pStyle w:val="Heading2"/>
+        <w:rPr>
+          <w:sz w:val="22"/>
+          <w:szCs w:val="22"/>
+        </w:rPr>
+      </w:pPr>
+      <w:bookmarkStart w:id="28" w:name="_Toc242045029"/>
+      <w:r>
+        <w:rPr>
+          <w:sz w:val="22"/>
+          <w:szCs w:val="22"/>
+        </w:rPr>
+        <w:t>What Phase 3 does:</w:t>
+      </w:r>
+      <w:bookmarkEnd w:id="28"/>
+    </w:p>
+    <w:p>
+      <w:pPr>
+        <w:rPr>
+          <w:sz w:val="22"/>
+          <w:szCs w:val="22"/>
+        </w:rPr>
+      </w:pPr>
+      <w:r>
+        <w:rPr>
+          <w:sz w:val="22"/>
+          <w:szCs w:val="22"/>
+        </w:rPr>
+        <w:t xml:space="preserve">Store the secret in AWS Secrets Manager, then have ECS pull it in at task start and set it as APP_SECRET inside the container. Your Flask app doesn’t change — it still reads </w:t>
+      </w:r>
+      <w:proofErr w:type="spellStart"/>
+      <w:proofErr w:type="gramStart"/>
+      <w:r>
+        <w:rPr>
+          <w:sz w:val="22"/>
+          <w:szCs w:val="22"/>
+        </w:rPr>
+        <w:t>os.environ</w:t>
+      </w:r>
+      <w:proofErr w:type="spellEnd"/>
+      <w:proofErr w:type="gramEnd"/>
+      <w:r>
+        <w:rPr>
+          <w:sz w:val="22"/>
+          <w:szCs w:val="22"/>
+        </w:rPr>
+        <w:t>["APP_SECRET"]. Only where the value comes from changed.</w:t>
+      </w:r>
+    </w:p>
+    <w:p>
+      <w:pPr>
+        <w:pStyle w:val="Heading2"/>
+        <w:rPr>
+          <w:sz w:val="22"/>
+          <w:szCs w:val="22"/>
+        </w:rPr>
+      </w:pPr>
+      <w:bookmarkStart w:id="29" w:name="_Toc242045030"/>
+      <w:r>
+        <w:rPr>
+          <w:sz w:val="22"/>
+          <w:szCs w:val="22"/>
+        </w:rPr>
+        <w:t>Flow</w:t>
+      </w:r>
+      <w:bookmarkEnd w:id="29"/>
+    </w:p>
+    <w:p>
+      <w:pPr>
+        <w:rPr>
+          <w:sz w:val="22"/>
+          <w:szCs w:val="22"/>
+        </w:rPr>
+      </w:pPr>
+      <w:r>
+        <w:rPr>
+          <w:sz w:val="22"/>
+          <w:szCs w:val="22"/>
+        </w:rPr>
+        <w:drawing>
+          <wp:inline distT="0" distB="0" distL="0" distR="0" wp14:anchorId="52D39CFA" wp14:editId="1B39FB77">
+            <wp:extent cx="4553585" cy="3334215"/>
+            <wp:effectExtent l="0" t="0" r="0" b="0"/>
+            <wp:docPr id="793628217" name="Picture 1"/>
+            <wp:cNvGraphicFramePr>
+              <a:graphicFrameLocks xmlns:a="http://schemas.openxmlformats.org/drawingml/2006/main" noChangeAspect="1"/>
+            </wp:cNvGraphicFramePr>
+            <a:graphic xmlns:a="http://schemas.openxmlformats.org/drawingml/2006/main">
+              <a:graphicData uri="http://schemas.openxmlformats.org/drawingml/2006/picture">
+                <pic:pic xmlns:pic="http://schemas.openxmlformats.org/drawingml/2006/picture">
+                  <pic:nvPicPr>
+                    <pic:cNvPr id="793628217" name=""/>
+                    <pic:cNvPicPr/>
+                  </pic:nvPicPr>
+                  <pic:blipFill>
+                    <a:blip r:embed="rId17"/>
+                    <a:stretch>
+                      <a:fillRect/>
+                    </a:stretch>
+                  </pic:blipFill>
+                  <pic:spPr>
+                    <a:xfrm>
+                      <a:off x="0" y="0"/>
+                      <a:ext cx="4553585" cy="3334215"/>
+                    </a:xfrm>
+                    <a:prstGeom prst="rect">
+                      <a:avLst/>
+                    </a:prstGeom>
+                  </pic:spPr>
+                </pic:pic>
+              </a:graphicData>
+            </a:graphic>
+          </wp:inline>
+        </w:drawing>
+      </w:r>
+    </w:p>
+    <w:p>
+      <w:pPr>
+        <w:pStyle w:val="Heading2"/>
+        <w:rPr>
+          <w:sz w:val="22"/>
+          <w:szCs w:val="22"/>
+        </w:rPr>
+      </w:pPr>
+      <w:bookmarkStart w:id="30" w:name="_Toc242045031"/>
+      <w:r>
+        <w:rPr>
+          <w:sz w:val="22"/>
+          <w:szCs w:val="22"/>
+        </w:rPr>
+        <w:lastRenderedPageBreak/>
+        <w:t>T</w:t>
+      </w:r>
+      <w:r>
+        <w:rPr>
+          <w:sz w:val="22"/>
+          <w:szCs w:val="22"/>
+        </w:rPr>
+        <w:t>wo IAM roles (why both)</w:t>
+      </w:r>
+      <w:bookmarkEnd w:id="30"/>
+    </w:p>
+    <w:p>
+      <w:pPr>
+        <w:rPr>
+          <w:sz w:val="22"/>
+          <w:szCs w:val="22"/>
+        </w:rPr>
+      </w:pPr>
+      <w:r>
+        <w:rPr>
+          <w:sz w:val="22"/>
+          <w:szCs w:val="22"/>
+        </w:rPr>
+        <w:drawing>
+          <wp:inline distT="0" distB="0" distL="0" distR="0" wp14:anchorId="5B92C377" wp14:editId="1CE0740D">
+            <wp:extent cx="5943600" cy="1423670"/>
+            <wp:effectExtent l="0" t="0" r="0" b="5080"/>
+            <wp:docPr id="377231028" name="Picture 1"/>
+            <wp:cNvGraphicFramePr>
+              <a:graphicFrameLocks xmlns:a="http://schemas.openxmlformats.org/drawingml/2006/main" noChangeAspect="1"/>
+            </wp:cNvGraphicFramePr>
+            <a:graphic xmlns:a="http://schemas.openxmlformats.org/drawingml/2006/main">
+              <a:graphicData uri="http://schemas.openxmlformats.org/drawingml/2006/picture">
+                <pic:pic xmlns:pic="http://schemas.openxmlformats.org/drawingml/2006/picture">
+                  <pic:nvPicPr>
+                    <pic:cNvPr id="377231028" name=""/>
+                    <pic:cNvPicPr/>
+                  </pic:nvPicPr>
+                  <pic:blipFill>
+                    <a:blip r:embed="rId18"/>
+                    <a:stretch>
+                      <a:fillRect/>
+                    </a:stretch>
+                  </pic:blipFill>
+                  <pic:spPr>
+                    <a:xfrm>
+                      <a:off x="0" y="0"/>
+                      <a:ext cx="5943600" cy="1423670"/>
+                    </a:xfrm>
+                    <a:prstGeom prst="rect">
+                      <a:avLst/>
+                    </a:prstGeom>
+                  </pic:spPr>
+                </pic:pic>
+              </a:graphicData>
+            </a:graphic>
+          </wp:inline>
+        </w:drawing>
+      </w:r>
+    </w:p>
+    <w:p>
+      <w:pPr>
+        <w:rPr>
+          <w:sz w:val="22"/>
+          <w:szCs w:val="22"/>
+        </w:rPr>
+      </w:pPr>
+      <w:r>
+        <w:rPr>
+          <w:sz w:val="22"/>
+          <w:szCs w:val="22"/>
+        </w:rPr>
+        <w:drawing>
+          <wp:inline distT="0" distB="0" distL="0" distR="0" wp14:anchorId="6EB93F9A" wp14:editId="6F557598">
+            <wp:extent cx="5943600" cy="630555"/>
+            <wp:effectExtent l="0" t="0" r="0" b="0"/>
+            <wp:docPr id="762567571" name="Picture 1"/>
+            <wp:cNvGraphicFramePr>
+              <a:graphicFrameLocks xmlns:a="http://schemas.openxmlformats.org/drawingml/2006/main" noChangeAspect="1"/>
+            </wp:cNvGraphicFramePr>
+            <a:graphic xmlns:a="http://schemas.openxmlformats.org/drawingml/2006/main">
+              <a:graphicData uri="http://schemas.openxmlformats.org/drawingml/2006/picture">
+                <pic:pic xmlns:pic="http://schemas.openxmlformats.org/drawingml/2006/picture">
+                  <pic:nvPicPr>
+                    <pic:cNvPr id="762567571" name=""/>
+                    <pic:cNvPicPr/>
+                  </pic:nvPicPr>
+                  <pic:blipFill>
+                    <a:blip r:embed="rId19"/>
+                    <a:stretch>
+                      <a:fillRect/>
+                    </a:stretch>
+                  </pic:blipFill>
+                  <pic:spPr>
+                    <a:xfrm>
+                      <a:off x="0" y="0"/>
+                      <a:ext cx="5943600" cy="630555"/>
+                    </a:xfrm>
+                    <a:prstGeom prst="rect">
+                      <a:avLst/>
+                    </a:prstGeom>
+                  </pic:spPr>
+                </pic:pic>
+              </a:graphicData>
+            </a:graphic>
+          </wp:inline>
+        </w:drawing>
+      </w:r>
+    </w:p>
+    <w:p>
+      <w:pPr>
+        <w:rPr>
+          <w:sz w:val="22"/>
+          <w:szCs w:val="22"/>
+        </w:rPr>
+      </w:pPr>
+      <w:r>
+        <w:rPr>
+          <w:sz w:val="22"/>
+          <w:szCs w:val="22"/>
+        </w:rPr>
+        <w:t>Both are limited to that secret’s ARN (least privilege), not “all secrets in the account.”</w:t>
+      </w:r>
+    </w:p>
+    <w:p>
+      <w:pPr>
+        <w:pStyle w:val="Heading2"/>
+        <w:rPr>
+          <w:sz w:val="22"/>
+          <w:szCs w:val="22"/>
+        </w:rPr>
+      </w:pPr>
+      <w:bookmarkStart w:id="31" w:name="_Toc242045032"/>
+      <w:r>
+        <w:rPr>
+          <w:sz w:val="22"/>
+          <w:szCs w:val="22"/>
+        </w:rPr>
+        <w:t>Phase 3 Takeaways</w:t>
+      </w:r>
+      <w:bookmarkEnd w:id="31"/>
+    </w:p>
+    <w:p>
+      <w:pPr>
+        <w:rPr>
+          <w:sz w:val="22"/>
+          <w:szCs w:val="22"/>
+        </w:rPr>
+      </w:pPr>
+      <w:r>
+        <w:rPr>
+          <w:sz w:val="22"/>
+          <w:szCs w:val="22"/>
+        </w:rPr>
+        <w:t>What you can prove in the console</w:t>
+      </w:r>
+    </w:p>
+    <w:p>
+      <w:pPr>
+        <w:pStyle w:val="ListParagraph"/>
         <w:numPr>
           <w:ilvl w:val="0"/>
-          <w:numId w:val="12"/>
+          <w:numId w:val="13"/>
         </w:numPr>
         <w:rPr>
           <w:sz w:val="22"/>
@@ -4571,14 +5548,15 @@
           <w:sz w:val="22"/>
           <w:szCs w:val="22"/>
         </w:rPr>
-        <w:t>Secrets Manager → project6/lab/app-secret</w:t>
-      </w:r>
-    </w:p>
-    <w:p>
-      <w:pPr>
+        <w:t>Secrets Manager has project6/lab/app-secret</w:t>
+      </w:r>
+    </w:p>
+    <w:p>
+      <w:pPr>
+        <w:pStyle w:val="ListParagraph"/>
         <w:numPr>
           <w:ilvl w:val="0"/>
-          <w:numId w:val="12"/>
+          <w:numId w:val="13"/>
         </w:numPr>
         <w:rPr>
           <w:sz w:val="22"/>
@@ -4590,14 +5568,15 @@
           <w:sz w:val="22"/>
           <w:szCs w:val="22"/>
         </w:rPr>
-        <w:t>ECS → Task definitions → project6-lab-api:2 → container secrets block</w:t>
-      </w:r>
-    </w:p>
-    <w:p>
-      <w:pPr>
+        <w:t>Task definition rev 2 shows APP_SECRET under Secrets, pointing at that ARN — not a plaintext value</w:t>
+      </w:r>
+    </w:p>
+    <w:p>
+      <w:pPr>
+        <w:pStyle w:val="ListParagraph"/>
         <w:numPr>
           <w:ilvl w:val="0"/>
-          <w:numId w:val="12"/>
+          <w:numId w:val="13"/>
         </w:numPr>
         <w:rPr>
           <w:sz w:val="22"/>
@@ -4609,16 +5588,397 @@
           <w:sz w:val="22"/>
           <w:szCs w:val="22"/>
         </w:rPr>
-        <w:t>IAM → Roles → project6-lab-ecs-execution / project6-lab-ecs-task → inline secret policies</w:t>
-      </w:r>
-    </w:p>
-    <w:p>
-      <w:pPr>
-        <w:rPr>
-          <w:sz w:val="22"/>
-          <w:szCs w:val="22"/>
-        </w:rPr>
-      </w:pPr>
+        <w:t>/</w:t>
+      </w:r>
+      <w:proofErr w:type="gramStart"/>
+      <w:r>
+        <w:rPr>
+          <w:sz w:val="22"/>
+          <w:szCs w:val="22"/>
+        </w:rPr>
+        <w:t>info</w:t>
+      </w:r>
+      <w:proofErr w:type="gramEnd"/>
+      <w:r>
+        <w:rPr>
+          <w:sz w:val="22"/>
+          <w:szCs w:val="22"/>
+        </w:rPr>
+        <w:t xml:space="preserve"> still says "</w:t>
+      </w:r>
+      <w:proofErr w:type="spellStart"/>
+      <w:r>
+        <w:rPr>
+          <w:sz w:val="22"/>
+          <w:szCs w:val="22"/>
+        </w:rPr>
+        <w:t>secret_configured</w:t>
+      </w:r>
+      <w:proofErr w:type="spellEnd"/>
+      <w:r>
+        <w:rPr>
+          <w:sz w:val="22"/>
+          <w:szCs w:val="22"/>
+        </w:rPr>
+        <w:t>": true</w:t>
+      </w:r>
+    </w:p>
+    <w:p>
+      <w:pPr>
+        <w:rPr>
+          <w:sz w:val="22"/>
+          <w:szCs w:val="22"/>
+        </w:rPr>
+      </w:pPr>
+      <w:r>
+        <w:rPr>
+          <w:sz w:val="22"/>
+          <w:szCs w:val="22"/>
+        </w:rPr>
+        <w:t>That’s Phase 3: secret stored centrally, injected at runtime, app never prints it, IAM scoped tightly.</w:t>
+      </w:r>
+    </w:p>
+    <w:p>
+      <w:pPr>
+        <w:pStyle w:val="Heading2"/>
+        <w:rPr>
+          <w:sz w:val="22"/>
+          <w:szCs w:val="22"/>
+        </w:rPr>
+      </w:pPr>
+      <w:bookmarkStart w:id="32" w:name="_Toc242045033"/>
+      <w:r>
+        <w:rPr>
+          <w:sz w:val="22"/>
+          <w:szCs w:val="22"/>
+        </w:rPr>
+        <w:t>IAM Roles Configurations</w:t>
+      </w:r>
+      <w:bookmarkEnd w:id="32"/>
+    </w:p>
+    <w:p>
+      <w:pPr>
+        <w:numPr>
+          <w:ilvl w:val="0"/>
+          <w:numId w:val="14"/>
+        </w:numPr>
+        <w:rPr>
+          <w:sz w:val="22"/>
+          <w:szCs w:val="22"/>
+        </w:rPr>
+      </w:pPr>
+      <w:r>
+        <w:rPr>
+          <w:sz w:val="22"/>
+          <w:szCs w:val="22"/>
+        </w:rPr>
+        <w:t>Trust policy — only ecs-tasks.amazonaws.com can assume it</w:t>
+      </w:r>
+    </w:p>
+    <w:p>
+      <w:pPr>
+        <w:numPr>
+          <w:ilvl w:val="0"/>
+          <w:numId w:val="14"/>
+        </w:numPr>
+        <w:rPr>
+          <w:sz w:val="22"/>
+          <w:szCs w:val="22"/>
+        </w:rPr>
+      </w:pPr>
+      <w:r>
+        <w:rPr>
+          <w:sz w:val="22"/>
+          <w:szCs w:val="22"/>
+        </w:rPr>
+        <w:t>Managed policy — </w:t>
+      </w:r>
+      <w:proofErr w:type="spellStart"/>
+      <w:r>
+        <w:rPr>
+          <w:sz w:val="22"/>
+          <w:szCs w:val="22"/>
+        </w:rPr>
+        <w:t>AmazonECSTaskExecutionRolePolicy</w:t>
+      </w:r>
+      <w:proofErr w:type="spellEnd"/>
+      <w:r>
+        <w:rPr>
+          <w:sz w:val="22"/>
+          <w:szCs w:val="22"/>
+        </w:rPr>
+        <w:t> (ECR pull + CloudWatch logs)</w:t>
+      </w:r>
+    </w:p>
+    <w:p>
+      <w:pPr>
+        <w:numPr>
+          <w:ilvl w:val="0"/>
+          <w:numId w:val="14"/>
+        </w:numPr>
+        <w:rPr>
+          <w:sz w:val="22"/>
+          <w:szCs w:val="22"/>
+        </w:rPr>
+      </w:pPr>
+      <w:r>
+        <w:rPr>
+          <w:sz w:val="22"/>
+          <w:szCs w:val="22"/>
+        </w:rPr>
+        <w:t xml:space="preserve">Inline policy (Phase </w:t>
+      </w:r>
+      <w:proofErr w:type="gramStart"/>
+      <w:r>
+        <w:rPr>
+          <w:sz w:val="22"/>
+          <w:szCs w:val="22"/>
+        </w:rPr>
+        <w:t>3) —</w:t>
+      </w:r>
+      <w:proofErr w:type="gramEnd"/>
+      <w:r>
+        <w:rPr>
+          <w:sz w:val="22"/>
+          <w:szCs w:val="22"/>
+        </w:rPr>
+        <w:t> GetSecretValue / DescribeSecret on only project6/lab/app-secret</w:t>
+      </w:r>
+    </w:p>
+    <w:p>
+      <w:pPr>
+        <w:rPr>
+          <w:sz w:val="22"/>
+          <w:szCs w:val="22"/>
+        </w:rPr>
+      </w:pPr>
+    </w:p>
+    <w:p>
+      <w:pPr>
+        <w:pStyle w:val="Heading1"/>
+        <w:rPr>
+          <w:sz w:val="22"/>
+          <w:szCs w:val="22"/>
+        </w:rPr>
+      </w:pPr>
+      <w:r>
+        <w:rPr>
+          <w:sz w:val="22"/>
+          <w:szCs w:val="22"/>
+        </w:rPr>
+        <w:lastRenderedPageBreak/>
+        <w:t>Phase 4 – Observability and Cost Guardrails</w:t>
+      </w:r>
+    </w:p>
+    <w:p>
+      <w:pPr>
+        <w:pStyle w:val="Heading2"/>
+        <w:rPr>
+          <w:sz w:val="22"/>
+          <w:szCs w:val="22"/>
+        </w:rPr>
+      </w:pPr>
+      <w:r>
+        <w:rPr>
+          <w:sz w:val="22"/>
+          <w:szCs w:val="22"/>
+        </w:rPr>
+        <w:t xml:space="preserve">CloudWatch Alarm </w:t>
+      </w:r>
+      <w:r>
+        <w:rPr>
+          <w:sz w:val="22"/>
+          <w:szCs w:val="22"/>
+        </w:rPr>
+        <w:t>Configured</w:t>
+      </w:r>
+    </w:p>
+    <w:p>
+      <w:pPr>
+        <w:rPr>
+          <w:sz w:val="22"/>
+          <w:szCs w:val="22"/>
+        </w:rPr>
+      </w:pPr>
+      <w:r>
+        <w:rPr>
+          <w:sz w:val="22"/>
+          <w:szCs w:val="22"/>
+        </w:rPr>
+        <w:drawing>
+          <wp:inline distT="0" distB="0" distL="0" distR="0" wp14:anchorId="13433238" wp14:editId="2444A154">
+            <wp:extent cx="5943600" cy="2187575"/>
+            <wp:effectExtent l="0" t="0" r="0" b="3175"/>
+            <wp:docPr id="1291478886" name="Picture 1"/>
+            <wp:cNvGraphicFramePr>
+              <a:graphicFrameLocks xmlns:a="http://schemas.openxmlformats.org/drawingml/2006/main" noChangeAspect="1"/>
+            </wp:cNvGraphicFramePr>
+            <a:graphic xmlns:a="http://schemas.openxmlformats.org/drawingml/2006/main">
+              <a:graphicData uri="http://schemas.openxmlformats.org/drawingml/2006/picture">
+                <pic:pic xmlns:pic="http://schemas.openxmlformats.org/drawingml/2006/picture">
+                  <pic:nvPicPr>
+                    <pic:cNvPr id="1291478886" name=""/>
+                    <pic:cNvPicPr/>
+                  </pic:nvPicPr>
+                  <pic:blipFill>
+                    <a:blip r:embed="rId20"/>
+                    <a:stretch>
+                      <a:fillRect/>
+                    </a:stretch>
+                  </pic:blipFill>
+                  <pic:spPr>
+                    <a:xfrm>
+                      <a:off x="0" y="0"/>
+                      <a:ext cx="5943600" cy="2187575"/>
+                    </a:xfrm>
+                    <a:prstGeom prst="rect">
+                      <a:avLst/>
+                    </a:prstGeom>
+                  </pic:spPr>
+                </pic:pic>
+              </a:graphicData>
+            </a:graphic>
+          </wp:inline>
+        </w:drawing>
+      </w:r>
+    </w:p>
+    <w:p>
+      <w:pPr>
+        <w:rPr>
+          <w:sz w:val="22"/>
+          <w:szCs w:val="22"/>
+        </w:rPr>
+      </w:pPr>
+    </w:p>
+    <w:p>
+      <w:pPr>
+        <w:pStyle w:val="Heading2"/>
+        <w:rPr>
+          <w:sz w:val="22"/>
+          <w:szCs w:val="22"/>
+        </w:rPr>
+      </w:pPr>
+      <w:r>
+        <w:rPr>
+          <w:sz w:val="22"/>
+          <w:szCs w:val="22"/>
+        </w:rPr>
+        <w:t>AWS Budget ($20)</w:t>
+      </w:r>
+    </w:p>
+    <w:p>
+      <w:pPr>
+        <w:rPr>
+          <w:sz w:val="22"/>
+          <w:szCs w:val="22"/>
+        </w:rPr>
+      </w:pPr>
+      <w:r>
+        <w:rPr>
+          <w:sz w:val="22"/>
+          <w:szCs w:val="22"/>
+        </w:rPr>
+        <w:drawing>
+          <wp:inline distT="0" distB="0" distL="0" distR="0" wp14:anchorId="32F399CA" wp14:editId="26AA5387">
+            <wp:extent cx="5943600" cy="1031875"/>
+            <wp:effectExtent l="0" t="0" r="0" b="0"/>
+            <wp:docPr id="835587000" name="Picture 1"/>
+            <wp:cNvGraphicFramePr>
+              <a:graphicFrameLocks xmlns:a="http://schemas.openxmlformats.org/drawingml/2006/main" noChangeAspect="1"/>
+            </wp:cNvGraphicFramePr>
+            <a:graphic xmlns:a="http://schemas.openxmlformats.org/drawingml/2006/main">
+              <a:graphicData uri="http://schemas.openxmlformats.org/drawingml/2006/picture">
+                <pic:pic xmlns:pic="http://schemas.openxmlformats.org/drawingml/2006/picture">
+                  <pic:nvPicPr>
+                    <pic:cNvPr id="835587000" name=""/>
+                    <pic:cNvPicPr/>
+                  </pic:nvPicPr>
+                  <pic:blipFill>
+                    <a:blip r:embed="rId21"/>
+                    <a:stretch>
+                      <a:fillRect/>
+                    </a:stretch>
+                  </pic:blipFill>
+                  <pic:spPr>
+                    <a:xfrm>
+                      <a:off x="0" y="0"/>
+                      <a:ext cx="5943600" cy="1031875"/>
+                    </a:xfrm>
+                    <a:prstGeom prst="rect">
+                      <a:avLst/>
+                    </a:prstGeom>
+                  </pic:spPr>
+                </pic:pic>
+              </a:graphicData>
+            </a:graphic>
+          </wp:inline>
+        </w:drawing>
+      </w:r>
+    </w:p>
+    <w:p>
+      <w:pPr>
+        <w:pStyle w:val="Heading2"/>
+        <w:rPr>
+          <w:sz w:val="22"/>
+          <w:szCs w:val="22"/>
+        </w:rPr>
+      </w:pPr>
+      <w:r>
+        <w:rPr>
+          <w:sz w:val="22"/>
+          <w:szCs w:val="22"/>
+        </w:rPr>
+        <w:t>SNS Topic</w:t>
+      </w:r>
+    </w:p>
+    <w:p>
+      <w:pPr>
+        <w:rPr>
+          <w:sz w:val="22"/>
+          <w:szCs w:val="22"/>
+        </w:rPr>
+      </w:pPr>
+      <w:r>
+        <w:rPr>
+          <w:sz w:val="22"/>
+          <w:szCs w:val="22"/>
+        </w:rPr>
+        <w:drawing>
+          <wp:inline distT="0" distB="0" distL="0" distR="0" wp14:anchorId="3738E5D3" wp14:editId="1CD5AA65">
+            <wp:extent cx="5715798" cy="2257740"/>
+            <wp:effectExtent l="0" t="0" r="0" b="9525"/>
+            <wp:docPr id="464874006" name="Picture 1"/>
+            <wp:cNvGraphicFramePr>
+              <a:graphicFrameLocks xmlns:a="http://schemas.openxmlformats.org/drawingml/2006/main" noChangeAspect="1"/>
+            </wp:cNvGraphicFramePr>
+            <a:graphic xmlns:a="http://schemas.openxmlformats.org/drawingml/2006/main">
+              <a:graphicData uri="http://schemas.openxmlformats.org/drawingml/2006/picture">
+                <pic:pic xmlns:pic="http://schemas.openxmlformats.org/drawingml/2006/picture">
+                  <pic:nvPicPr>
+                    <pic:cNvPr id="464874006" name=""/>
+                    <pic:cNvPicPr/>
+                  </pic:nvPicPr>
+                  <pic:blipFill>
+                    <a:blip r:embed="rId22"/>
+                    <a:stretch>
+                      <a:fillRect/>
+                    </a:stretch>
+                  </pic:blipFill>
+                  <pic:spPr>
+                    <a:xfrm>
+                      <a:off x="0" y="0"/>
+                      <a:ext cx="5715798" cy="2257740"/>
+                    </a:xfrm>
+                    <a:prstGeom prst="rect">
+                      <a:avLst/>
+                    </a:prstGeom>
+                  </pic:spPr>
+                </pic:pic>
+              </a:graphicData>
+            </a:graphic>
+          </wp:inline>
+        </w:drawing>
+      </w:r>
     </w:p>
     <w:sectPr>
       <w:pgSz w:w="12240" w:h="15840"/>
@@ -4895,6 +6255,119 @@
     </w:lvl>
   </w:abstractNum>
   <w:abstractNum w:abstractNumId="2" w15:restartNumberingAfterBreak="0">
+    <w:nsid w:val="32506F63"/>
+    <w:multiLevelType w:val="multilevel"/>
+    <w:tmpl w:val="01C8AF4C"/>
+    <w:lvl w:ilvl="0">
+      <w:start w:val="1"/>
+      <w:numFmt w:val="decimal"/>
+      <w:lvlText w:val="%1."/>
+      <w:lvlJc w:val="left"/>
+      <w:pPr>
+        <w:tabs>
+          <w:tab w:val="num" w:pos="720"/>
+        </w:tabs>
+        <w:ind w:left="720" w:hanging="360"/>
+      </w:pPr>
+    </w:lvl>
+    <w:lvl w:ilvl="1" w:tentative="1">
+      <w:start w:val="1"/>
+      <w:numFmt w:val="decimal"/>
+      <w:lvlText w:val="%2."/>
+      <w:lvlJc w:val="left"/>
+      <w:pPr>
+        <w:tabs>
+          <w:tab w:val="num" w:pos="1440"/>
+        </w:tabs>
+        <w:ind w:left="1440" w:hanging="360"/>
+      </w:pPr>
+    </w:lvl>
+    <w:lvl w:ilvl="2" w:tentative="1">
+      <w:start w:val="1"/>
+      <w:numFmt w:val="decimal"/>
+      <w:lvlText w:val="%3."/>
+      <w:lvlJc w:val="left"/>
+      <w:pPr>
+        <w:tabs>
+          <w:tab w:val="num" w:pos="2160"/>
+        </w:tabs>
+        <w:ind w:left="2160" w:hanging="360"/>
+      </w:pPr>
+    </w:lvl>
+    <w:lvl w:ilvl="3" w:tentative="1">
+      <w:start w:val="1"/>
+      <w:numFmt w:val="decimal"/>
+      <w:lvlText w:val="%4."/>
+      <w:lvlJc w:val="left"/>
+      <w:pPr>
+        <w:tabs>
+          <w:tab w:val="num" w:pos="2880"/>
+        </w:tabs>
+        <w:ind w:left="2880" w:hanging="360"/>
+      </w:pPr>
+    </w:lvl>
+    <w:lvl w:ilvl="4" w:tentative="1">
+      <w:start w:val="1"/>
+      <w:numFmt w:val="decimal"/>
+      <w:lvlText w:val="%5."/>
+      <w:lvlJc w:val="left"/>
+      <w:pPr>
+        <w:tabs>
+          <w:tab w:val="num" w:pos="3600"/>
+        </w:tabs>
+        <w:ind w:left="3600" w:hanging="360"/>
+      </w:pPr>
+    </w:lvl>
+    <w:lvl w:ilvl="5" w:tentative="1">
+      <w:start w:val="1"/>
+      <w:numFmt w:val="decimal"/>
+      <w:lvlText w:val="%6."/>
+      <w:lvlJc w:val="left"/>
+      <w:pPr>
+        <w:tabs>
+          <w:tab w:val="num" w:pos="4320"/>
+        </w:tabs>
+        <w:ind w:left="4320" w:hanging="360"/>
+      </w:pPr>
+    </w:lvl>
+    <w:lvl w:ilvl="6" w:tentative="1">
+      <w:start w:val="1"/>
+      <w:numFmt w:val="decimal"/>
+      <w:lvlText w:val="%7."/>
+      <w:lvlJc w:val="left"/>
+      <w:pPr>
+        <w:tabs>
+          <w:tab w:val="num" w:pos="5040"/>
+        </w:tabs>
+        <w:ind w:left="5040" w:hanging="360"/>
+      </w:pPr>
+    </w:lvl>
+    <w:lvl w:ilvl="7" w:tentative="1">
+      <w:start w:val="1"/>
+      <w:numFmt w:val="decimal"/>
+      <w:lvlText w:val="%8."/>
+      <w:lvlJc w:val="left"/>
+      <w:pPr>
+        <w:tabs>
+          <w:tab w:val="num" w:pos="5760"/>
+        </w:tabs>
+        <w:ind w:left="5760" w:hanging="360"/>
+      </w:pPr>
+    </w:lvl>
+    <w:lvl w:ilvl="8" w:tentative="1">
+      <w:start w:val="1"/>
+      <w:numFmt w:val="decimal"/>
+      <w:lvlText w:val="%9."/>
+      <w:lvlJc w:val="left"/>
+      <w:pPr>
+        <w:tabs>
+          <w:tab w:val="num" w:pos="6480"/>
+        </w:tabs>
+        <w:ind w:left="6480" w:hanging="360"/>
+      </w:pPr>
+    </w:lvl>
+  </w:abstractNum>
+  <w:abstractNum w:abstractNumId="3" w15:restartNumberingAfterBreak="0">
     <w:nsid w:val="3D5E7FC1"/>
     <w:multiLevelType w:val="hybridMultilevel"/>
     <w:tmpl w:val="EECCC7E2"/>
@@ -5007,7 +6480,7 @@
       </w:rPr>
     </w:lvl>
   </w:abstractNum>
-  <w:abstractNum w:abstractNumId="3" w15:restartNumberingAfterBreak="0">
+  <w:abstractNum w:abstractNumId="4" w15:restartNumberingAfterBreak="0">
     <w:nsid w:val="3F4743B5"/>
     <w:multiLevelType w:val="multilevel"/>
     <w:tmpl w:val="9FBC8F06"/>
@@ -5156,7 +6629,7 @@
       </w:rPr>
     </w:lvl>
   </w:abstractNum>
-  <w:abstractNum w:abstractNumId="4" w15:restartNumberingAfterBreak="0">
+  <w:abstractNum w:abstractNumId="5" w15:restartNumberingAfterBreak="0">
     <w:nsid w:val="3F625108"/>
     <w:multiLevelType w:val="hybridMultilevel"/>
     <w:tmpl w:val="56126ECA"/>
@@ -5245,7 +6718,7 @@
       </w:pPr>
     </w:lvl>
   </w:abstractNum>
-  <w:abstractNum w:abstractNumId="5" w15:restartNumberingAfterBreak="0">
+  <w:abstractNum w:abstractNumId="6" w15:restartNumberingAfterBreak="0">
     <w:nsid w:val="3FC66048"/>
     <w:multiLevelType w:val="multilevel"/>
     <w:tmpl w:val="054CB0B8"/>
@@ -5358,7 +6831,7 @@
       </w:pPr>
     </w:lvl>
   </w:abstractNum>
-  <w:abstractNum w:abstractNumId="6" w15:restartNumberingAfterBreak="0">
+  <w:abstractNum w:abstractNumId="7" w15:restartNumberingAfterBreak="0">
     <w:nsid w:val="48DC6E35"/>
     <w:multiLevelType w:val="multilevel"/>
     <w:tmpl w:val="5E66D9F6"/>
@@ -5471,7 +6944,7 @@
       </w:pPr>
     </w:lvl>
   </w:abstractNum>
-  <w:abstractNum w:abstractNumId="7" w15:restartNumberingAfterBreak="0">
+  <w:abstractNum w:abstractNumId="8" w15:restartNumberingAfterBreak="0">
     <w:nsid w:val="53F94E43"/>
     <w:multiLevelType w:val="multilevel"/>
     <w:tmpl w:val="6572453E"/>
@@ -5584,7 +7057,7 @@
       </w:pPr>
     </w:lvl>
   </w:abstractNum>
-  <w:abstractNum w:abstractNumId="8" w15:restartNumberingAfterBreak="0">
+  <w:abstractNum w:abstractNumId="9" w15:restartNumberingAfterBreak="0">
     <w:nsid w:val="547310ED"/>
     <w:multiLevelType w:val="multilevel"/>
     <w:tmpl w:val="143E0514"/>
@@ -5697,7 +7170,156 @@
       </w:pPr>
     </w:lvl>
   </w:abstractNum>
-  <w:abstractNum w:abstractNumId="9" w15:restartNumberingAfterBreak="0">
+  <w:abstractNum w:abstractNumId="10" w15:restartNumberingAfterBreak="0">
+    <w:nsid w:val="551C606E"/>
+    <w:multiLevelType w:val="multilevel"/>
+    <w:tmpl w:val="9FBC8F06"/>
+    <w:lvl w:ilvl="0">
+      <w:start w:val="1"/>
+      <w:numFmt w:val="bullet"/>
+      <w:lvlText w:val=""/>
+      <w:lvlJc w:val="left"/>
+      <w:pPr>
+        <w:tabs>
+          <w:tab w:val="num" w:pos="720"/>
+        </w:tabs>
+        <w:ind w:left="720" w:hanging="360"/>
+      </w:pPr>
+      <w:rPr>
+        <w:rFonts w:ascii="Symbol" w:hAnsi="Symbol" w:hint="default"/>
+        <w:sz w:val="20"/>
+      </w:rPr>
+    </w:lvl>
+    <w:lvl w:ilvl="1" w:tentative="1">
+      <w:start w:val="1"/>
+      <w:numFmt w:val="bullet"/>
+      <w:lvlText w:val="o"/>
+      <w:lvlJc w:val="left"/>
+      <w:pPr>
+        <w:tabs>
+          <w:tab w:val="num" w:pos="1440"/>
+        </w:tabs>
+        <w:ind w:left="1440" w:hanging="360"/>
+      </w:pPr>
+      <w:rPr>
+        <w:rFonts w:ascii="Courier New" w:hAnsi="Courier New" w:hint="default"/>
+        <w:sz w:val="20"/>
+      </w:rPr>
+    </w:lvl>
+    <w:lvl w:ilvl="2" w:tentative="1">
+      <w:start w:val="1"/>
+      <w:numFmt w:val="bullet"/>
+      <w:lvlText w:val=""/>
+      <w:lvlJc w:val="left"/>
+      <w:pPr>
+        <w:tabs>
+          <w:tab w:val="num" w:pos="2160"/>
+        </w:tabs>
+        <w:ind w:left="2160" w:hanging="360"/>
+      </w:pPr>
+      <w:rPr>
+        <w:rFonts w:ascii="Wingdings" w:hAnsi="Wingdings" w:hint="default"/>
+        <w:sz w:val="20"/>
+      </w:rPr>
+    </w:lvl>
+    <w:lvl w:ilvl="3" w:tentative="1">
+      <w:start w:val="1"/>
+      <w:numFmt w:val="bullet"/>
+      <w:lvlText w:val=""/>
+      <w:lvlJc w:val="left"/>
+      <w:pPr>
+        <w:tabs>
+          <w:tab w:val="num" w:pos="2880"/>
+        </w:tabs>
+        <w:ind w:left="2880" w:hanging="360"/>
+      </w:pPr>
+      <w:rPr>
+        <w:rFonts w:ascii="Wingdings" w:hAnsi="Wingdings" w:hint="default"/>
+        <w:sz w:val="20"/>
+      </w:rPr>
+    </w:lvl>
+    <w:lvl w:ilvl="4" w:tentative="1">
+      <w:start w:val="1"/>
+      <w:numFmt w:val="bullet"/>
+      <w:lvlText w:val=""/>
+      <w:lvlJc w:val="left"/>
+      <w:pPr>
+        <w:tabs>
+          <w:tab w:val="num" w:pos="3600"/>
+        </w:tabs>
+        <w:ind w:left="3600" w:hanging="360"/>
+      </w:pPr>
+      <w:rPr>
+        <w:rFonts w:ascii="Wingdings" w:hAnsi="Wingdings" w:hint="default"/>
+        <w:sz w:val="20"/>
+      </w:rPr>
+    </w:lvl>
+    <w:lvl w:ilvl="5" w:tentative="1">
+      <w:start w:val="1"/>
+      <w:numFmt w:val="bullet"/>
+      <w:lvlText w:val=""/>
+      <w:lvlJc w:val="left"/>
+      <w:pPr>
+        <w:tabs>
+          <w:tab w:val="num" w:pos="4320"/>
+        </w:tabs>
+        <w:ind w:left="4320" w:hanging="360"/>
+      </w:pPr>
+      <w:rPr>
+        <w:rFonts w:ascii="Wingdings" w:hAnsi="Wingdings" w:hint="default"/>
+        <w:sz w:val="20"/>
+      </w:rPr>
+    </w:lvl>
+    <w:lvl w:ilvl="6" w:tentative="1">
+      <w:start w:val="1"/>
+      <w:numFmt w:val="bullet"/>
+      <w:lvlText w:val=""/>
+      <w:lvlJc w:val="left"/>
+      <w:pPr>
+        <w:tabs>
+          <w:tab w:val="num" w:pos="5040"/>
+        </w:tabs>
+        <w:ind w:left="5040" w:hanging="360"/>
+      </w:pPr>
+      <w:rPr>
+        <w:rFonts w:ascii="Wingdings" w:hAnsi="Wingdings" w:hint="default"/>
+        <w:sz w:val="20"/>
+      </w:rPr>
+    </w:lvl>
+    <w:lvl w:ilvl="7" w:tentative="1">
+      <w:start w:val="1"/>
+      <w:numFmt w:val="bullet"/>
+      <w:lvlText w:val=""/>
+      <w:lvlJc w:val="left"/>
+      <w:pPr>
+        <w:tabs>
+          <w:tab w:val="num" w:pos="5760"/>
+        </w:tabs>
+        <w:ind w:left="5760" w:hanging="360"/>
+      </w:pPr>
+      <w:rPr>
+        <w:rFonts w:ascii="Wingdings" w:hAnsi="Wingdings" w:hint="default"/>
+        <w:sz w:val="20"/>
+      </w:rPr>
+    </w:lvl>
+    <w:lvl w:ilvl="8" w:tentative="1">
+      <w:start w:val="1"/>
+      <w:numFmt w:val="bullet"/>
+      <w:lvlText w:val=""/>
+      <w:lvlJc w:val="left"/>
+      <w:pPr>
+        <w:tabs>
+          <w:tab w:val="num" w:pos="6480"/>
+        </w:tabs>
+        <w:ind w:left="6480" w:hanging="360"/>
+      </w:pPr>
+      <w:rPr>
+        <w:rFonts w:ascii="Wingdings" w:hAnsi="Wingdings" w:hint="default"/>
+        <w:sz w:val="20"/>
+      </w:rPr>
+    </w:lvl>
+  </w:abstractNum>
+  <w:abstractNum w:abstractNumId="11" w15:restartNumberingAfterBreak="0">
     <w:nsid w:val="5B755CB2"/>
     <w:multiLevelType w:val="multilevel"/>
     <w:tmpl w:val="9FBC8F06"/>
@@ -5846,7 +7468,7 @@
       </w:rPr>
     </w:lvl>
   </w:abstractNum>
-  <w:abstractNum w:abstractNumId="10" w15:restartNumberingAfterBreak="0">
+  <w:abstractNum w:abstractNumId="12" w15:restartNumberingAfterBreak="0">
     <w:nsid w:val="703C100F"/>
     <w:multiLevelType w:val="multilevel"/>
     <w:tmpl w:val="9FBC8F06"/>
@@ -5995,7 +7617,7 @@
       </w:rPr>
     </w:lvl>
   </w:abstractNum>
-  <w:abstractNum w:abstractNumId="11" w15:restartNumberingAfterBreak="0">
+  <w:abstractNum w:abstractNumId="13" w15:restartNumberingAfterBreak="0">
     <w:nsid w:val="7C650B32"/>
     <w:multiLevelType w:val="hybridMultilevel"/>
     <w:tmpl w:val="E9BC75E8"/>
@@ -6085,40 +7707,46 @@
     </w:lvl>
   </w:abstractNum>
   <w:num w:numId="1" w16cid:durableId="2064140109">
-    <w:abstractNumId w:val="4"/>
+    <w:abstractNumId w:val="5"/>
   </w:num>
   <w:num w:numId="2" w16cid:durableId="2045011593">
     <w:abstractNumId w:val="0"/>
   </w:num>
   <w:num w:numId="3" w16cid:durableId="1706248986">
+    <w:abstractNumId w:val="8"/>
+  </w:num>
+  <w:num w:numId="4" w16cid:durableId="685209948">
+    <w:abstractNumId w:val="12"/>
+  </w:num>
+  <w:num w:numId="5" w16cid:durableId="726537687">
     <w:abstractNumId w:val="7"/>
   </w:num>
-  <w:num w:numId="4" w16cid:durableId="685209948">
-    <w:abstractNumId w:val="10"/>
-  </w:num>
-  <w:num w:numId="5" w16cid:durableId="726537687">
-    <w:abstractNumId w:val="6"/>
-  </w:num>
   <w:num w:numId="6" w16cid:durableId="401102314">
-    <w:abstractNumId w:val="8"/>
+    <w:abstractNumId w:val="9"/>
   </w:num>
   <w:num w:numId="7" w16cid:durableId="959342523">
-    <w:abstractNumId w:val="2"/>
+    <w:abstractNumId w:val="3"/>
   </w:num>
   <w:num w:numId="8" w16cid:durableId="1470130563">
     <w:abstractNumId w:val="1"/>
   </w:num>
   <w:num w:numId="9" w16cid:durableId="2112242193">
-    <w:abstractNumId w:val="3"/>
+    <w:abstractNumId w:val="4"/>
   </w:num>
   <w:num w:numId="10" w16cid:durableId="383407482">
+    <w:abstractNumId w:val="13"/>
+  </w:num>
+  <w:num w:numId="11" w16cid:durableId="1918250528">
     <w:abstractNumId w:val="11"/>
   </w:num>
-  <w:num w:numId="11" w16cid:durableId="1918250528">
-    <w:abstractNumId w:val="9"/>
+  <w:num w:numId="12" w16cid:durableId="116728785">
+    <w:abstractNumId w:val="6"/>
   </w:num>
-  <w:num w:numId="12" w16cid:durableId="116728785">
-    <w:abstractNumId w:val="5"/>
+  <w:num w:numId="13" w16cid:durableId="1337540470">
+    <w:abstractNumId w:val="10"/>
+  </w:num>
+  <w:num w:numId="14" w16cid:durableId="955912275">
+    <w:abstractNumId w:val="2"/>
   </w:num>
 </w:numbering>
 </file>

</xml_diff>

<commit_message>
Harden Project 6 image base and packages for Trivy CI
</commit_message>
<xml_diff>
--- a/project-6-secure-containers/docs/Project 6 - What was Implemented.docx
+++ b/project-6-secure-containers/docs/Project 6 - What was Implemented.docx
@@ -8461,6 +8461,7 @@
       </w:pPr>
       <w:r>
         <w:rPr>
+          <w:noProof/>
           <w:sz w:val="22"/>
           <w:szCs w:val="22"/>
         </w:rPr>
@@ -8527,6 +8528,7 @@
       </w:pPr>
       <w:r>
         <w:rPr>
+          <w:noProof/>
           <w:sz w:val="22"/>
           <w:szCs w:val="22"/>
         </w:rPr>
@@ -8576,6 +8578,7 @@
       </w:pPr>
       <w:r>
         <w:rPr>
+          <w:noProof/>
           <w:sz w:val="22"/>
           <w:szCs w:val="22"/>
         </w:rPr>
@@ -8626,6 +8629,7 @@
       </w:pPr>
       <w:r>
         <w:rPr>
+          <w:noProof/>
           <w:sz w:val="22"/>
           <w:szCs w:val="22"/>
         </w:rPr>
@@ -8702,6 +8706,7 @@
       </w:pPr>
       <w:r>
         <w:rPr>
+          <w:noProof/>
           <w:sz w:val="22"/>
           <w:szCs w:val="22"/>
         </w:rPr>
@@ -8751,6 +8756,7 @@
       </w:pPr>
       <w:r>
         <w:rPr>
+          <w:noProof/>
           <w:sz w:val="22"/>
           <w:szCs w:val="22"/>
         </w:rPr>
@@ -8821,6 +8827,7 @@
       </w:pPr>
       <w:r>
         <w:rPr>
+          <w:noProof/>
           <w:sz w:val="22"/>
           <w:szCs w:val="22"/>
         </w:rPr>
@@ -8930,6 +8937,7 @@
       </w:pPr>
       <w:r>
         <w:rPr>
+          <w:noProof/>
           <w:sz w:val="22"/>
           <w:szCs w:val="22"/>
         </w:rPr>
@@ -9026,6 +9034,7 @@
       </w:pPr>
       <w:r>
         <w:rPr>
+          <w:noProof/>
           <w:sz w:val="22"/>
           <w:szCs w:val="22"/>
         </w:rPr>
@@ -9076,6 +9085,7 @@
       </w:pPr>
       <w:r>
         <w:rPr>
+          <w:noProof/>
           <w:sz w:val="22"/>
           <w:szCs w:val="22"/>
         </w:rPr>
@@ -9141,6 +9151,7 @@
       </w:pPr>
       <w:r>
         <w:rPr>
+          <w:noProof/>
           <w:sz w:val="22"/>
           <w:szCs w:val="22"/>
         </w:rPr>
@@ -9220,6 +9231,7 @@
       </w:pPr>
       <w:r>
         <w:rPr>
+          <w:noProof/>
           <w:sz w:val="22"/>
           <w:szCs w:val="22"/>
         </w:rPr>
@@ -9260,8 +9272,283 @@
         </w:drawing>
       </w:r>
     </w:p>
+    <w:p>
+      <w:pPr>
+        <w:pStyle w:val="Heading1"/>
+        <w:rPr>
+          <w:sz w:val="22"/>
+          <w:szCs w:val="22"/>
+        </w:rPr>
+      </w:pPr>
+      <w:r>
+        <w:rPr>
+          <w:sz w:val="22"/>
+          <w:szCs w:val="22"/>
+        </w:rPr>
+        <w:lastRenderedPageBreak/>
+        <w:t xml:space="preserve">Trivy Scan </w:t>
+      </w:r>
+      <w:r>
+        <w:rPr>
+          <w:sz w:val="22"/>
+          <w:szCs w:val="22"/>
+        </w:rPr>
+        <w:t>Updated</w:t>
+      </w:r>
+    </w:p>
+    <w:p>
+      <w:r>
+        <w:t xml:space="preserve">The scan actually fails the workflow now if vulnerabilities are found with the image. Before it would only “report” the findings but still proceed with the </w:t>
+      </w:r>
+      <w:r>
+        <w:t>workflow.</w:t>
+      </w:r>
+    </w:p>
+    <w:p>
+      <w:pPr>
+        <w:rPr>
+          <w:sz w:val="22"/>
+          <w:szCs w:val="22"/>
+        </w:rPr>
+      </w:pPr>
+      <w:r>
+        <w:rPr>
+          <w:sz w:val="22"/>
+          <w:szCs w:val="22"/>
+        </w:rPr>
+        <w:t>Faile</w:t>
+      </w:r>
+      <w:r>
+        <w:rPr>
+          <w:sz w:val="22"/>
+          <w:szCs w:val="22"/>
+        </w:rPr>
+        <w:t>d</w:t>
+      </w:r>
+      <w:r>
+        <w:rPr>
+          <w:sz w:val="22"/>
+          <w:szCs w:val="22"/>
+        </w:rPr>
+        <w:t xml:space="preserve"> the pipeline before deploying to ECR</w:t>
+      </w:r>
+      <w:r>
+        <w:rPr>
+          <w:sz w:val="22"/>
+          <w:szCs w:val="22"/>
+        </w:rPr>
+        <w:t xml:space="preserve"> if high or critical app vulnerabilities are found</w:t>
+      </w:r>
+    </w:p>
+    <w:p>
+      <w:pPr>
+        <w:rPr>
+          <w:sz w:val="22"/>
+          <w:szCs w:val="22"/>
+        </w:rPr>
+      </w:pPr>
+      <w:r>
+        <w:rPr>
+          <w:sz w:val="22"/>
+          <w:szCs w:val="22"/>
+        </w:rPr>
+        <w:drawing>
+          <wp:inline distT="0" distB="0" distL="0" distR="0" wp14:anchorId="0CD01D83" wp14:editId="29545A23">
+            <wp:extent cx="5943600" cy="2942590"/>
+            <wp:effectExtent l="0" t="0" r="0" b="0"/>
+            <wp:docPr id="1261817394" name="Picture 1"/>
+            <wp:cNvGraphicFramePr>
+              <a:graphicFrameLocks xmlns:a="http://schemas.openxmlformats.org/drawingml/2006/main" noChangeAspect="1"/>
+            </wp:cNvGraphicFramePr>
+            <a:graphic xmlns:a="http://schemas.openxmlformats.org/drawingml/2006/main">
+              <a:graphicData uri="http://schemas.openxmlformats.org/drawingml/2006/picture">
+                <pic:pic xmlns:pic="http://schemas.openxmlformats.org/drawingml/2006/picture">
+                  <pic:nvPicPr>
+                    <pic:cNvPr id="1261817394" name=""/>
+                    <pic:cNvPicPr/>
+                  </pic:nvPicPr>
+                  <pic:blipFill>
+                    <a:blip r:embed="rId50"/>
+                    <a:stretch>
+                      <a:fillRect/>
+                    </a:stretch>
+                  </pic:blipFill>
+                  <pic:spPr>
+                    <a:xfrm>
+                      <a:off x="0" y="0"/>
+                      <a:ext cx="5943600" cy="2942590"/>
+                    </a:xfrm>
+                    <a:prstGeom prst="rect">
+                      <a:avLst/>
+                    </a:prstGeom>
+                  </pic:spPr>
+                </pic:pic>
+              </a:graphicData>
+            </a:graphic>
+          </wp:inline>
+        </w:drawing>
+      </w:r>
+    </w:p>
+    <w:p>
+      <w:pPr>
+        <w:pStyle w:val="ListParagraph"/>
+        <w:numPr>
+          <w:ilvl w:val="0"/>
+          <w:numId w:val="25"/>
+        </w:numPr>
+        <w:rPr>
+          <w:sz w:val="22"/>
+          <w:szCs w:val="22"/>
+        </w:rPr>
+      </w:pPr>
+      <w:r>
+        <w:rPr>
+          <w:sz w:val="22"/>
+          <w:szCs w:val="22"/>
+        </w:rPr>
+        <w:t>Findings are mostly stale OS packages in the pinned python:3.12.7-slim-bookworm base (openssl, glibc, perl)—</w:t>
+      </w:r>
+    </w:p>
+    <w:p>
+      <w:pPr>
+        <w:pStyle w:val="ListParagraph"/>
+        <w:numPr>
+          <w:ilvl w:val="0"/>
+          <w:numId w:val="25"/>
+        </w:numPr>
+        <w:rPr>
+          <w:sz w:val="22"/>
+          <w:szCs w:val="22"/>
+        </w:rPr>
+      </w:pPr>
+      <w:r>
+        <w:rPr>
+          <w:sz w:val="22"/>
+          <w:szCs w:val="22"/>
+        </w:rPr>
+        <w:t>Fix</w:t>
+      </w:r>
+    </w:p>
+    <w:p>
+      <w:pPr>
+        <w:pStyle w:val="ListParagraph"/>
+        <w:numPr>
+          <w:ilvl w:val="1"/>
+          <w:numId w:val="25"/>
+        </w:numPr>
+        <w:rPr>
+          <w:sz w:val="22"/>
+          <w:szCs w:val="22"/>
+        </w:rPr>
+      </w:pPr>
+      <w:r>
+        <w:rPr>
+          <w:sz w:val="22"/>
+          <w:szCs w:val="22"/>
+        </w:rPr>
+        <w:t>Updating the Dockerfile to a newer base and applying OS package upgrades.</w:t>
+      </w:r>
+    </w:p>
+    <w:p>
+      <w:pPr>
+        <w:rPr>
+          <w:sz w:val="22"/>
+          <w:szCs w:val="22"/>
+        </w:rPr>
+      </w:pPr>
+      <w:r>
+        <w:rPr>
+          <w:sz w:val="22"/>
+          <w:szCs w:val="22"/>
+        </w:rPr>
+        <w:drawing>
+          <wp:inline distT="0" distB="0" distL="0" distR="0" wp14:anchorId="4C85197C" wp14:editId="74FB1F2A">
+            <wp:extent cx="5943600" cy="1094105"/>
+            <wp:effectExtent l="0" t="0" r="0" b="0"/>
+            <wp:docPr id="1211249573" name="Picture 1"/>
+            <wp:cNvGraphicFramePr>
+              <a:graphicFrameLocks xmlns:a="http://schemas.openxmlformats.org/drawingml/2006/main" noChangeAspect="1"/>
+            </wp:cNvGraphicFramePr>
+            <a:graphic xmlns:a="http://schemas.openxmlformats.org/drawingml/2006/main">
+              <a:graphicData uri="http://schemas.openxmlformats.org/drawingml/2006/picture">
+                <pic:pic xmlns:pic="http://schemas.openxmlformats.org/drawingml/2006/picture">
+                  <pic:nvPicPr>
+                    <pic:cNvPr id="1211249573" name=""/>
+                    <pic:cNvPicPr/>
+                  </pic:nvPicPr>
+                  <pic:blipFill>
+                    <a:blip r:embed="rId51"/>
+                    <a:stretch>
+                      <a:fillRect/>
+                    </a:stretch>
+                  </pic:blipFill>
+                  <pic:spPr>
+                    <a:xfrm>
+                      <a:off x="0" y="0"/>
+                      <a:ext cx="5943600" cy="1094105"/>
+                    </a:xfrm>
+                    <a:prstGeom prst="rect">
+                      <a:avLst/>
+                    </a:prstGeom>
+                  </pic:spPr>
+                </pic:pic>
+              </a:graphicData>
+            </a:graphic>
+          </wp:inline>
+        </w:drawing>
+      </w:r>
+    </w:p>
+    <w:p>
+      <w:pPr>
+        <w:rPr>
+          <w:sz w:val="22"/>
+          <w:szCs w:val="22"/>
+        </w:rPr>
+      </w:pPr>
+      <w:r>
+        <w:rPr>
+          <w:sz w:val="22"/>
+          <w:szCs w:val="22"/>
+        </w:rPr>
+        <w:drawing>
+          <wp:inline distT="0" distB="0" distL="0" distR="0" wp14:anchorId="4CB297C6" wp14:editId="7A756244">
+            <wp:extent cx="4105848" cy="762106"/>
+            <wp:effectExtent l="0" t="0" r="9525" b="0"/>
+            <wp:docPr id="816347655" name="Picture 1"/>
+            <wp:cNvGraphicFramePr>
+              <a:graphicFrameLocks xmlns:a="http://schemas.openxmlformats.org/drawingml/2006/main" noChangeAspect="1"/>
+            </wp:cNvGraphicFramePr>
+            <a:graphic xmlns:a="http://schemas.openxmlformats.org/drawingml/2006/main">
+              <a:graphicData uri="http://schemas.openxmlformats.org/drawingml/2006/picture">
+                <pic:pic xmlns:pic="http://schemas.openxmlformats.org/drawingml/2006/picture">
+                  <pic:nvPicPr>
+                    <pic:cNvPr id="816347655" name=""/>
+                    <pic:cNvPicPr/>
+                  </pic:nvPicPr>
+                  <pic:blipFill>
+                    <a:blip r:embed="rId52"/>
+                    <a:stretch>
+                      <a:fillRect/>
+                    </a:stretch>
+                  </pic:blipFill>
+                  <pic:spPr>
+                    <a:xfrm>
+                      <a:off x="0" y="0"/>
+                      <a:ext cx="4105848" cy="762106"/>
+                    </a:xfrm>
+                    <a:prstGeom prst="rect">
+                      <a:avLst/>
+                    </a:prstGeom>
+                  </pic:spPr>
+                </pic:pic>
+              </a:graphicData>
+            </a:graphic>
+          </wp:inline>
+        </w:drawing>
+      </w:r>
+    </w:p>
     <w:sectPr>
-      <w:headerReference w:type="default" r:id="rId50"/>
+      <w:headerReference w:type="default" r:id="rId53"/>
       <w:pgSz w:w="12240" w:h="15840"/>
       <w:pgMar w:top="1440" w:right="1440" w:bottom="1440" w:left="1440" w:header="720" w:footer="720" w:gutter="0"/>
       <w:cols w:space="720"/>
@@ -12360,6 +12647,119 @@
     </w:lvl>
   </w:abstractNum>
   <w:abstractNum w:abstractNumId="23" w15:restartNumberingAfterBreak="0">
+    <w:nsid w:val="769C0573"/>
+    <w:multiLevelType w:val="hybridMultilevel"/>
+    <w:tmpl w:val="973438FA"/>
+    <w:lvl w:ilvl="0" w:tplc="04090001">
+      <w:start w:val="1"/>
+      <w:numFmt w:val="bullet"/>
+      <w:lvlText w:val=""/>
+      <w:lvlJc w:val="left"/>
+      <w:pPr>
+        <w:ind w:left="720" w:hanging="360"/>
+      </w:pPr>
+      <w:rPr>
+        <w:rFonts w:ascii="Symbol" w:hAnsi="Symbol" w:hint="default"/>
+      </w:rPr>
+    </w:lvl>
+    <w:lvl w:ilvl="1" w:tplc="04090003">
+      <w:start w:val="1"/>
+      <w:numFmt w:val="bullet"/>
+      <w:lvlText w:val="o"/>
+      <w:lvlJc w:val="left"/>
+      <w:pPr>
+        <w:ind w:left="1440" w:hanging="360"/>
+      </w:pPr>
+      <w:rPr>
+        <w:rFonts w:ascii="Courier New" w:hAnsi="Courier New" w:cs="Courier New" w:hint="default"/>
+      </w:rPr>
+    </w:lvl>
+    <w:lvl w:ilvl="2" w:tplc="04090005" w:tentative="1">
+      <w:start w:val="1"/>
+      <w:numFmt w:val="bullet"/>
+      <w:lvlText w:val=""/>
+      <w:lvlJc w:val="left"/>
+      <w:pPr>
+        <w:ind w:left="2160" w:hanging="360"/>
+      </w:pPr>
+      <w:rPr>
+        <w:rFonts w:ascii="Wingdings" w:hAnsi="Wingdings" w:hint="default"/>
+      </w:rPr>
+    </w:lvl>
+    <w:lvl w:ilvl="3" w:tplc="04090001" w:tentative="1">
+      <w:start w:val="1"/>
+      <w:numFmt w:val="bullet"/>
+      <w:lvlText w:val=""/>
+      <w:lvlJc w:val="left"/>
+      <w:pPr>
+        <w:ind w:left="2880" w:hanging="360"/>
+      </w:pPr>
+      <w:rPr>
+        <w:rFonts w:ascii="Symbol" w:hAnsi="Symbol" w:hint="default"/>
+      </w:rPr>
+    </w:lvl>
+    <w:lvl w:ilvl="4" w:tplc="04090003" w:tentative="1">
+      <w:start w:val="1"/>
+      <w:numFmt w:val="bullet"/>
+      <w:lvlText w:val="o"/>
+      <w:lvlJc w:val="left"/>
+      <w:pPr>
+        <w:ind w:left="3600" w:hanging="360"/>
+      </w:pPr>
+      <w:rPr>
+        <w:rFonts w:ascii="Courier New" w:hAnsi="Courier New" w:cs="Courier New" w:hint="default"/>
+      </w:rPr>
+    </w:lvl>
+    <w:lvl w:ilvl="5" w:tplc="04090005" w:tentative="1">
+      <w:start w:val="1"/>
+      <w:numFmt w:val="bullet"/>
+      <w:lvlText w:val=""/>
+      <w:lvlJc w:val="left"/>
+      <w:pPr>
+        <w:ind w:left="4320" w:hanging="360"/>
+      </w:pPr>
+      <w:rPr>
+        <w:rFonts w:ascii="Wingdings" w:hAnsi="Wingdings" w:hint="default"/>
+      </w:rPr>
+    </w:lvl>
+    <w:lvl w:ilvl="6" w:tplc="04090001" w:tentative="1">
+      <w:start w:val="1"/>
+      <w:numFmt w:val="bullet"/>
+      <w:lvlText w:val=""/>
+      <w:lvlJc w:val="left"/>
+      <w:pPr>
+        <w:ind w:left="5040" w:hanging="360"/>
+      </w:pPr>
+      <w:rPr>
+        <w:rFonts w:ascii="Symbol" w:hAnsi="Symbol" w:hint="default"/>
+      </w:rPr>
+    </w:lvl>
+    <w:lvl w:ilvl="7" w:tplc="04090003" w:tentative="1">
+      <w:start w:val="1"/>
+      <w:numFmt w:val="bullet"/>
+      <w:lvlText w:val="o"/>
+      <w:lvlJc w:val="left"/>
+      <w:pPr>
+        <w:ind w:left="5760" w:hanging="360"/>
+      </w:pPr>
+      <w:rPr>
+        <w:rFonts w:ascii="Courier New" w:hAnsi="Courier New" w:cs="Courier New" w:hint="default"/>
+      </w:rPr>
+    </w:lvl>
+    <w:lvl w:ilvl="8" w:tplc="04090005" w:tentative="1">
+      <w:start w:val="1"/>
+      <w:numFmt w:val="bullet"/>
+      <w:lvlText w:val=""/>
+      <w:lvlJc w:val="left"/>
+      <w:pPr>
+        <w:ind w:left="6480" w:hanging="360"/>
+      </w:pPr>
+      <w:rPr>
+        <w:rFonts w:ascii="Wingdings" w:hAnsi="Wingdings" w:hint="default"/>
+      </w:rPr>
+    </w:lvl>
+  </w:abstractNum>
+  <w:abstractNum w:abstractNumId="24" w15:restartNumberingAfterBreak="0">
     <w:nsid w:val="7C650B32"/>
     <w:multiLevelType w:val="hybridMultilevel"/>
     <w:tmpl w:val="E9BC75E8"/>
@@ -12476,7 +12876,7 @@
     <w:abstractNumId w:val="11"/>
   </w:num>
   <w:num w:numId="10" w16cid:durableId="383407482">
-    <w:abstractNumId w:val="23"/>
+    <w:abstractNumId w:val="24"/>
   </w:num>
   <w:num w:numId="11" w16cid:durableId="1918250528">
     <w:abstractNumId w:val="20"/>
@@ -12519,6 +12919,9 @@
   </w:num>
   <w:num w:numId="24" w16cid:durableId="678002256">
     <w:abstractNumId w:val="2"/>
+  </w:num>
+  <w:num w:numId="25" w16cid:durableId="401487551">
+    <w:abstractNumId w:val="23"/>
   </w:num>
 </w:numbering>
 </file>

</xml_diff>